<commit_message>
IA3 praise King Jesus Christ our LORD
</commit_message>
<xml_diff>
--- a/41IA Intelektualnyj analiz danyh/3/IA_KNT-122_Onyshchenko_19_PR3.docx
+++ b/41IA Intelektualnyj analiz danyh/3/IA_KNT-122_Onyshchenko_19_PR3.docx
@@ -971,30 +971,117 @@
     </w:p>
     <w:p>
       <w:pPr>
-        <w:pStyle w:val="p11"/>
-        <w:rPr/>
-      </w:pPr>
-      <w:r>
-        <w:rPr/>
-      </w:r>
-    </w:p>
-    <w:p>
-      <w:pPr>
-        <w:pStyle w:val="p11"/>
-        <w:rPr/>
-      </w:pPr>
-      <w:r>
-        <w:rPr/>
-        <w:t>Розробку моделей наведено нижче на рисунках:</w:t>
-      </w:r>
-    </w:p>
-    <w:p>
-      <w:pPr>
-        <w:pStyle w:val="IMG1"/>
-        <w:rPr/>
-      </w:pPr>
-      <w:r>
-        <w:rPr/>
+        <w:pStyle w:val="H2"/>
+        <w:rPr>
+          <w:b/>
+          <w:bCs/>
+        </w:rPr>
+      </w:pPr>
+      <w:r>
+        <w:rPr>
+          <w:b/>
+          <w:bCs/>
+          <w:i w:val="false"/>
+          <w:caps w:val="false"/>
+          <w:smallCaps w:val="false"/>
+          <w:spacing w:val="0"/>
+        </w:rPr>
+        <w:t xml:space="preserve">1 </w:t>
+      </w:r>
+      <w:r>
+        <w:rPr>
+          <w:b/>
+          <w:bCs/>
+          <w:i w:val="false"/>
+          <w:caps w:val="false"/>
+          <w:smallCaps w:val="false"/>
+          <w:spacing w:val="0"/>
+        </w:rPr>
+        <w:t>З</w:t>
+      </w:r>
+      <w:r>
+        <w:rPr>
+          <w:b/>
+          <w:bCs/>
+          <w:i w:val="false"/>
+          <w:caps w:val="false"/>
+          <w:smallCaps w:val="false"/>
+          <w:spacing w:val="0"/>
+        </w:rPr>
+        <w:t>авантажити вибірку з лабораторної роботи 2</w:t>
+      </w:r>
+    </w:p>
+    <w:p>
+      <w:pPr>
+        <w:pStyle w:val="P1"/>
+        <w:rPr>
+          <w:b/>
+          <w:bCs/>
+          <w:i w:val="false"/>
+          <w:i w:val="false"/>
+          <w:caps w:val="false"/>
+          <w:smallCaps w:val="false"/>
+          <w:spacing w:val="0"/>
+        </w:rPr>
+      </w:pPr>
+      <w:r>
+        <w:rPr>
+          <w:b/>
+          <w:bCs/>
+          <w:i w:val="false"/>
+          <w:caps w:val="false"/>
+          <w:smallCaps w:val="false"/>
+          <w:spacing w:val="0"/>
+        </w:rPr>
+      </w:r>
+    </w:p>
+    <w:p>
+      <w:pPr>
+        <w:pStyle w:val="P1"/>
+        <w:rPr>
+          <w:b w:val="false"/>
+          <w:bCs w:val="false"/>
+          <w:i w:val="false"/>
+          <w:i w:val="false"/>
+          <w:caps w:val="false"/>
+          <w:smallCaps w:val="false"/>
+          <w:spacing w:val="0"/>
+        </w:rPr>
+      </w:pPr>
+      <w:r>
+        <w:rPr>
+          <w:b w:val="false"/>
+          <w:bCs w:val="false"/>
+          <w:i w:val="false"/>
+          <w:caps w:val="false"/>
+          <w:smallCaps w:val="false"/>
+          <w:spacing w:val="0"/>
+        </w:rPr>
+        <w:t>Вибірку завантажено, деталі на рисунку нижче:</w:t>
+      </w:r>
+    </w:p>
+    <w:p>
+      <w:pPr>
+        <w:pStyle w:val="P1"/>
+        <w:rPr>
+          <w:b w:val="false"/>
+          <w:bCs w:val="false"/>
+          <w:i w:val="false"/>
+          <w:i w:val="false"/>
+          <w:caps w:val="false"/>
+          <w:smallCaps w:val="false"/>
+          <w:spacing w:val="0"/>
+        </w:rPr>
+      </w:pPr>
+      <w:r>
+        <w:rPr>
+          <w:b w:val="false"/>
+          <w:bCs w:val="false"/>
+          <w:i w:val="false"/>
+          <w:caps w:val="false"/>
+          <w:smallCaps w:val="false"/>
+          <w:spacing w:val="0"/>
+        </w:rPr>
       </w:r>
     </w:p>
     <w:p>
@@ -1006,9 +1093,9 @@
         <w:rPr/>
         <w:drawing>
           <wp:inline distT="0" distB="0" distL="0" distR="0">
-            <wp:extent cx="5731510" cy="6161405"/>
+            <wp:extent cx="4384040" cy="4824095"/>
             <wp:effectExtent l="0" t="0" r="0" b="0"/>
-            <wp:docPr id="1" name="Зображення1"/>
+            <wp:docPr id="1" name="Зображення8"/>
             <wp:cNvGraphicFramePr>
               <a:graphicFrameLocks xmlns:a="http://schemas.openxmlformats.org/drawingml/2006/main" noChangeAspect="1"/>
             </wp:cNvGraphicFramePr>
@@ -1016,7 +1103,7 @@
               <a:graphicData uri="http://schemas.openxmlformats.org/drawingml/2006/picture">
                 <pic:pic xmlns:pic="http://schemas.openxmlformats.org/drawingml/2006/picture">
                   <pic:nvPicPr>
-                    <pic:cNvPr id="1" name="Зображення1"/>
+                    <pic:cNvPr id="1" name="Зображення8"/>
                     <pic:cNvPicPr>
                       <a:picLocks noChangeAspect="1" noChangeArrowheads="1"/>
                     </pic:cNvPicPr>
@@ -1030,7 +1117,7 @@
                   <pic:spPr bwMode="auto">
                     <a:xfrm>
                       <a:off x="0" y="0"/>
-                      <a:ext cx="5731510" cy="6161405"/>
+                      <a:ext cx="4384040" cy="4824095"/>
                     </a:xfrm>
                     <a:prstGeom prst="rect">
                       <a:avLst/>
@@ -1051,13 +1138,89 @@
       </w:pPr>
       <w:r>
         <w:rPr/>
-        <w:t xml:space="preserve">Рисунок 1.1 — Модель </w:t>
-      </w:r>
-      <w:r>
-        <w:rPr>
-          <w:lang w:val="en-US"/>
-        </w:rPr>
-        <w:t>ZeroR</w:t>
+        <w:t>Рисунок 1.1 — Завантажена вибірка</w:t>
+      </w:r>
+    </w:p>
+    <w:p>
+      <w:pPr>
+        <w:pStyle w:val="P1"/>
+        <w:rPr>
+          <w:b/>
+          <w:bCs/>
+          <w:i w:val="false"/>
+          <w:i w:val="false"/>
+          <w:caps w:val="false"/>
+          <w:smallCaps w:val="false"/>
+          <w:spacing w:val="0"/>
+        </w:rPr>
+      </w:pPr>
+      <w:r>
+        <w:rPr>
+          <w:b/>
+          <w:bCs/>
+          <w:i w:val="false"/>
+          <w:caps w:val="false"/>
+          <w:smallCaps w:val="false"/>
+          <w:spacing w:val="0"/>
+        </w:rPr>
+      </w:r>
+    </w:p>
+    <w:p>
+      <w:pPr>
+        <w:pStyle w:val="H2"/>
+        <w:rPr/>
+      </w:pPr>
+      <w:r>
+        <w:rPr>
+          <w:b/>
+          <w:bCs/>
+          <w:i w:val="false"/>
+          <w:caps w:val="false"/>
+          <w:smallCaps w:val="false"/>
+          <w:spacing w:val="0"/>
+        </w:rPr>
+        <w:t xml:space="preserve">2 </w:t>
+      </w:r>
+      <w:r>
+        <w:rPr>
+          <w:b/>
+          <w:bCs/>
+          <w:i w:val="false"/>
+          <w:caps w:val="false"/>
+          <w:smallCaps w:val="false"/>
+          <w:spacing w:val="0"/>
+        </w:rPr>
+        <w:t>П</w:t>
+      </w:r>
+      <w:r>
+        <w:rPr>
+          <w:b/>
+          <w:bCs/>
+          <w:i w:val="false"/>
+          <w:caps w:val="false"/>
+          <w:smallCaps w:val="false"/>
+          <w:spacing w:val="0"/>
+        </w:rPr>
+        <w:t>обудувати та оцінити моделі класифікації</w:t>
+      </w:r>
+    </w:p>
+    <w:p>
+      <w:pPr>
+        <w:pStyle w:val="p11"/>
+        <w:rPr/>
+      </w:pPr>
+      <w:r>
+        <w:rPr/>
+      </w:r>
+    </w:p>
+    <w:p>
+      <w:pPr>
+        <w:pStyle w:val="p11"/>
+        <w:rPr/>
+      </w:pPr>
+      <w:r>
+        <w:rPr/>
+        <w:t>Створені моделі наведено нижче на рисунках:</w:t>
       </w:r>
     </w:p>
     <w:p>
@@ -1078,9 +1241,9 @@
         <w:rPr/>
         <w:drawing>
           <wp:inline distT="0" distB="0" distL="0" distR="0">
-            <wp:extent cx="5731510" cy="6161405"/>
+            <wp:extent cx="6645910" cy="6571615"/>
             <wp:effectExtent l="0" t="0" r="0" b="0"/>
-            <wp:docPr id="2" name="Зображення2"/>
+            <wp:docPr id="2" name="Зображення1"/>
             <wp:cNvGraphicFramePr>
               <a:graphicFrameLocks xmlns:a="http://schemas.openxmlformats.org/drawingml/2006/main" noChangeAspect="1"/>
             </wp:cNvGraphicFramePr>
@@ -1088,7 +1251,7 @@
               <a:graphicData uri="http://schemas.openxmlformats.org/drawingml/2006/picture">
                 <pic:pic xmlns:pic="http://schemas.openxmlformats.org/drawingml/2006/picture">
                   <pic:nvPicPr>
-                    <pic:cNvPr id="2" name="Зображення2"/>
+                    <pic:cNvPr id="2" name="Зображення1"/>
                     <pic:cNvPicPr>
                       <a:picLocks noChangeAspect="1" noChangeArrowheads="1"/>
                     </pic:cNvPicPr>
@@ -1102,7 +1265,7 @@
                   <pic:spPr bwMode="auto">
                     <a:xfrm>
                       <a:off x="0" y="0"/>
-                      <a:ext cx="5731510" cy="6161405"/>
+                      <a:ext cx="6645910" cy="6571615"/>
                     </a:xfrm>
                     <a:prstGeom prst="rect">
                       <a:avLst/>
@@ -1123,13 +1286,27 @@
       </w:pPr>
       <w:r>
         <w:rPr/>
-        <w:t xml:space="preserve">Рисунок 1.2 — Модель </w:t>
+        <w:t xml:space="preserve">Рисунок </w:t>
+      </w:r>
+      <w:r>
+        <w:rPr/>
+        <w:t>2</w:t>
+      </w:r>
+      <w:r>
+        <w:rPr/>
+        <w:t xml:space="preserve">.1 — </w:t>
+      </w:r>
+      <w:r>
+        <w:rPr>
+          <w:lang w:val="uk-UA"/>
+        </w:rPr>
+        <w:t xml:space="preserve">Модель </w:t>
       </w:r>
       <w:r>
         <w:rPr>
           <w:lang w:val="en-US"/>
         </w:rPr>
-        <w:t>OneR</w:t>
+        <w:t>Rules.ZeroR</w:t>
       </w:r>
     </w:p>
     <w:p>
@@ -1147,12 +1324,19 @@
         <w:rPr/>
       </w:pPr>
       <w:r>
-        <w:rPr/>
         <w:drawing>
-          <wp:inline distT="0" distB="0" distL="0" distR="0">
-            <wp:extent cx="5731510" cy="6161405"/>
+          <wp:anchor behindDoc="0" distT="0" distB="0" distL="0" distR="0" simplePos="0" locked="0" layoutInCell="0" allowOverlap="1" relativeHeight="4">
+            <wp:simplePos x="0" y="0"/>
+            <wp:positionH relativeFrom="column">
+              <wp:align>center</wp:align>
+            </wp:positionH>
+            <wp:positionV relativeFrom="paragraph">
+              <wp:posOffset>635</wp:posOffset>
+            </wp:positionV>
+            <wp:extent cx="7430135" cy="8174990"/>
             <wp:effectExtent l="0" t="0" r="0" b="0"/>
-            <wp:docPr id="3" name="Зображення3"/>
+            <wp:wrapSquare wrapText="largest"/>
+            <wp:docPr id="3" name="Зображення2"/>
             <wp:cNvGraphicFramePr>
               <a:graphicFrameLocks xmlns:a="http://schemas.openxmlformats.org/drawingml/2006/main" noChangeAspect="1"/>
             </wp:cNvGraphicFramePr>
@@ -1160,7 +1344,7 @@
               <a:graphicData uri="http://schemas.openxmlformats.org/drawingml/2006/picture">
                 <pic:pic xmlns:pic="http://schemas.openxmlformats.org/drawingml/2006/picture">
                   <pic:nvPicPr>
-                    <pic:cNvPr id="3" name="Зображення3"/>
+                    <pic:cNvPr id="3" name="Зображення2"/>
                     <pic:cNvPicPr>
                       <a:picLocks noChangeAspect="1" noChangeArrowheads="1"/>
                     </pic:cNvPicPr>
@@ -1174,7 +1358,7 @@
                   <pic:spPr bwMode="auto">
                     <a:xfrm>
                       <a:off x="0" y="0"/>
-                      <a:ext cx="5731510" cy="6161405"/>
+                      <a:ext cx="7430135" cy="8174990"/>
                     </a:xfrm>
                     <a:prstGeom prst="rect">
                       <a:avLst/>
@@ -1184,24 +1368,26 @@
                 </pic:pic>
               </a:graphicData>
             </a:graphic>
-          </wp:inline>
+          </wp:anchor>
         </w:drawing>
       </w:r>
-    </w:p>
-    <w:p>
-      <w:pPr>
-        <w:pStyle w:val="IMG1"/>
-        <w:rPr/>
-      </w:pPr>
-      <w:r>
-        <w:rPr/>
-        <w:t xml:space="preserve">Рисунок 1.3 — Модель </w:t>
+      <w:r>
+        <w:rPr/>
+        <w:t xml:space="preserve">Рисунок </w:t>
+      </w:r>
+      <w:r>
+        <w:rPr/>
+        <w:t>2</w:t>
+      </w:r>
+      <w:r>
+        <w:rPr/>
+        <w:t xml:space="preserve">.2 — Модель </w:t>
       </w:r>
       <w:r>
         <w:rPr>
           <w:lang w:val="en-US"/>
         </w:rPr>
-        <w:t>NaiveBayes</w:t>
+        <w:t>Rules.OneR</w:t>
       </w:r>
     </w:p>
     <w:p>
@@ -1222,9 +1408,9 @@
         <w:rPr/>
         <w:drawing>
           <wp:inline distT="0" distB="0" distL="0" distR="0">
-            <wp:extent cx="5731510" cy="6161405"/>
+            <wp:extent cx="6645910" cy="7348220"/>
             <wp:effectExtent l="0" t="0" r="0" b="0"/>
-            <wp:docPr id="4" name="Зображення4"/>
+            <wp:docPr id="4" name="Зображення9"/>
             <wp:cNvGraphicFramePr>
               <a:graphicFrameLocks xmlns:a="http://schemas.openxmlformats.org/drawingml/2006/main" noChangeAspect="1"/>
             </wp:cNvGraphicFramePr>
@@ -1232,7 +1418,7 @@
               <a:graphicData uri="http://schemas.openxmlformats.org/drawingml/2006/picture">
                 <pic:pic xmlns:pic="http://schemas.openxmlformats.org/drawingml/2006/picture">
                   <pic:nvPicPr>
-                    <pic:cNvPr id="4" name="Зображення4"/>
+                    <pic:cNvPr id="4" name="Зображення9"/>
                     <pic:cNvPicPr>
                       <a:picLocks noChangeAspect="1" noChangeArrowheads="1"/>
                     </pic:cNvPicPr>
@@ -1246,7 +1432,7 @@
                   <pic:spPr bwMode="auto">
                     <a:xfrm>
                       <a:off x="0" y="0"/>
-                      <a:ext cx="5731510" cy="6161405"/>
+                      <a:ext cx="6645910" cy="7348220"/>
                     </a:xfrm>
                     <a:prstGeom prst="rect">
                       <a:avLst/>
@@ -1267,13 +1453,7 @@
       </w:pPr>
       <w:r>
         <w:rPr/>
-        <w:t xml:space="preserve">Рисунок 1.4 — Модель </w:t>
-      </w:r>
-      <w:r>
-        <w:rPr>
-          <w:lang w:val="en-US"/>
-        </w:rPr>
-        <w:t>J48</w:t>
+        <w:t>Рисунок 2.3 — Модель Rules.Prism</w:t>
       </w:r>
     </w:p>
     <w:p>
@@ -1294,9 +1474,9 @@
         <w:rPr/>
         <w:drawing>
           <wp:inline distT="0" distB="0" distL="0" distR="0">
-            <wp:extent cx="5731510" cy="6161405"/>
+            <wp:extent cx="6645910" cy="7348220"/>
             <wp:effectExtent l="0" t="0" r="0" b="0"/>
-            <wp:docPr id="5" name="Зображення5"/>
+            <wp:docPr id="5" name="Зображення3"/>
             <wp:cNvGraphicFramePr>
               <a:graphicFrameLocks xmlns:a="http://schemas.openxmlformats.org/drawingml/2006/main" noChangeAspect="1"/>
             </wp:cNvGraphicFramePr>
@@ -1304,7 +1484,7 @@
               <a:graphicData uri="http://schemas.openxmlformats.org/drawingml/2006/picture">
                 <pic:pic xmlns:pic="http://schemas.openxmlformats.org/drawingml/2006/picture">
                   <pic:nvPicPr>
-                    <pic:cNvPr id="5" name="Зображення5"/>
+                    <pic:cNvPr id="5" name="Зображення3"/>
                     <pic:cNvPicPr>
                       <a:picLocks noChangeAspect="1" noChangeArrowheads="1"/>
                     </pic:cNvPicPr>
@@ -1318,7 +1498,7 @@
                   <pic:spPr bwMode="auto">
                     <a:xfrm>
                       <a:off x="0" y="0"/>
-                      <a:ext cx="5731510" cy="6161405"/>
+                      <a:ext cx="6645910" cy="7348220"/>
                     </a:xfrm>
                     <a:prstGeom prst="rect">
                       <a:avLst/>
@@ -1339,13 +1519,33 @@
       </w:pPr>
       <w:r>
         <w:rPr/>
-        <w:t xml:space="preserve">Рисунок 1.5 — Модель </w:t>
+        <w:t xml:space="preserve">Рисунок </w:t>
       </w:r>
       <w:r>
         <w:rPr>
           <w:lang w:val="en-US"/>
         </w:rPr>
-        <w:t>SMO</w:t>
+        <w:t>2</w:t>
+      </w:r>
+      <w:r>
+        <w:rPr/>
+        <w:t>.</w:t>
+      </w:r>
+      <w:r>
+        <w:rPr>
+          <w:lang w:val="en-US"/>
+        </w:rPr>
+        <w:t>4</w:t>
+      </w:r>
+      <w:r>
+        <w:rPr/>
+        <w:t xml:space="preserve"> — Модель </w:t>
+      </w:r>
+      <w:r>
+        <w:rPr>
+          <w:lang w:val="en-US"/>
+        </w:rPr>
+        <w:t>Bayes.NaiveBayes</w:t>
       </w:r>
     </w:p>
     <w:p>
@@ -1366,9 +1566,9 @@
         <w:rPr/>
         <w:drawing>
           <wp:inline distT="0" distB="0" distL="0" distR="0">
-            <wp:extent cx="5731510" cy="6161405"/>
+            <wp:extent cx="6645910" cy="7623810"/>
             <wp:effectExtent l="0" t="0" r="0" b="0"/>
-            <wp:docPr id="6" name="Зображення6"/>
+            <wp:docPr id="6" name="Зображення4"/>
             <wp:cNvGraphicFramePr>
               <a:graphicFrameLocks xmlns:a="http://schemas.openxmlformats.org/drawingml/2006/main" noChangeAspect="1"/>
             </wp:cNvGraphicFramePr>
@@ -1376,7 +1576,7 @@
               <a:graphicData uri="http://schemas.openxmlformats.org/drawingml/2006/picture">
                 <pic:pic xmlns:pic="http://schemas.openxmlformats.org/drawingml/2006/picture">
                   <pic:nvPicPr>
-                    <pic:cNvPr id="6" name="Зображення6"/>
+                    <pic:cNvPr id="6" name="Зображення4"/>
                     <pic:cNvPicPr>
                       <a:picLocks noChangeAspect="1" noChangeArrowheads="1"/>
                     </pic:cNvPicPr>
@@ -1390,7 +1590,7 @@
                   <pic:spPr bwMode="auto">
                     <a:xfrm>
                       <a:off x="0" y="0"/>
-                      <a:ext cx="5731510" cy="6161405"/>
+                      <a:ext cx="6645910" cy="7623810"/>
                     </a:xfrm>
                     <a:prstGeom prst="rect">
                       <a:avLst/>
@@ -1411,49 +1611,42 @@
       </w:pPr>
       <w:r>
         <w:rPr/>
-        <w:t xml:space="preserve">Рисунок 1.6 — Модель </w:t>
+        <w:t xml:space="preserve">Рисунок </w:t>
       </w:r>
       <w:r>
         <w:rPr>
           <w:lang w:val="en-US"/>
         </w:rPr>
-        <w:t>IBk</w:t>
-      </w:r>
-    </w:p>
-    <w:p>
-      <w:pPr>
-        <w:pStyle w:val="p11"/>
+        <w:t>2</w:t>
+      </w:r>
+      <w:r>
+        <w:rPr/>
+        <w:t>.</w:t>
+      </w:r>
+      <w:r>
         <w:rPr>
           <w:lang w:val="en-US"/>
         </w:rPr>
-      </w:pPr>
+        <w:t>5</w:t>
+      </w:r>
+      <w:r>
+        <w:rPr/>
+        <w:t xml:space="preserve"> — Модель </w:t>
+      </w:r>
       <w:r>
         <w:rPr>
           <w:lang w:val="en-US"/>
         </w:rPr>
-      </w:r>
-    </w:p>
-    <w:p>
-      <w:pPr>
-        <w:pStyle w:val="H2"/>
-        <w:rPr/>
-      </w:pPr>
-      <w:r>
-        <w:rPr/>
-        <w:t>Порівняння</w:t>
-      </w:r>
-    </w:p>
-    <w:p>
-      <w:pPr>
-        <w:pStyle w:val="p11"/>
-        <w:rPr>
-          <w:lang w:val="uk-UA"/>
-        </w:rPr>
-      </w:pPr>
-      <w:r>
-        <w:rPr>
-          <w:lang w:val="uk-UA"/>
-        </w:rPr>
+        <w:t>Trees.J48</w:t>
+      </w:r>
+    </w:p>
+    <w:p>
+      <w:pPr>
+        <w:pStyle w:val="IMG1"/>
+        <w:rPr/>
+      </w:pPr>
+      <w:r>
+        <w:rPr/>
       </w:r>
     </w:p>
     <w:p>
@@ -1465,9 +1658,9 @@
         <w:rPr/>
         <w:drawing>
           <wp:inline distT="0" distB="0" distL="0" distR="0">
-            <wp:extent cx="5731510" cy="4318000"/>
+            <wp:extent cx="6356350" cy="7976870"/>
             <wp:effectExtent l="0" t="0" r="0" b="0"/>
-            <wp:docPr id="7" name="Зображення7"/>
+            <wp:docPr id="7" name="Зображення5"/>
             <wp:cNvGraphicFramePr>
               <a:graphicFrameLocks xmlns:a="http://schemas.openxmlformats.org/drawingml/2006/main" noChangeAspect="1"/>
             </wp:cNvGraphicFramePr>
@@ -1475,7 +1668,7 @@
               <a:graphicData uri="http://schemas.openxmlformats.org/drawingml/2006/picture">
                 <pic:pic xmlns:pic="http://schemas.openxmlformats.org/drawingml/2006/picture">
                   <pic:nvPicPr>
-                    <pic:cNvPr id="7" name="Зображення7"/>
+                    <pic:cNvPr id="7" name="Зображення5"/>
                     <pic:cNvPicPr>
                       <a:picLocks noChangeAspect="1" noChangeArrowheads="1"/>
                     </pic:cNvPicPr>
@@ -1489,7 +1682,7 @@
                   <pic:spPr bwMode="auto">
                     <a:xfrm>
                       <a:off x="0" y="0"/>
-                      <a:ext cx="5731510" cy="4318000"/>
+                      <a:ext cx="6356350" cy="7976870"/>
                     </a:xfrm>
                     <a:prstGeom prst="rect">
                       <a:avLst/>
@@ -1510,12 +1703,1946 @@
       </w:pPr>
       <w:r>
         <w:rPr/>
-        <w:t>Рисунок 2.1 — Порівняння моделей</w:t>
+        <w:t xml:space="preserve">Рисунок </w:t>
+      </w:r>
+      <w:r>
+        <w:rPr>
+          <w:lang w:val="en-US"/>
+        </w:rPr>
+        <w:t>2</w:t>
+      </w:r>
+      <w:r>
+        <w:rPr/>
+        <w:t>.</w:t>
+      </w:r>
+      <w:r>
+        <w:rPr>
+          <w:lang w:val="en-US"/>
+        </w:rPr>
+        <w:t>6</w:t>
+      </w:r>
+      <w:r>
+        <w:rPr/>
+        <w:t xml:space="preserve"> — Модель </w:t>
+      </w:r>
+      <w:r>
+        <w:rPr>
+          <w:lang w:val="en-US"/>
+        </w:rPr>
+        <w:t>Functions.SMO</w:t>
       </w:r>
     </w:p>
     <w:p>
       <w:pPr>
         <w:pStyle w:val="IMG1"/>
+        <w:rPr/>
+      </w:pPr>
+      <w:r>
+        <w:rPr/>
+      </w:r>
+    </w:p>
+    <w:p>
+      <w:pPr>
+        <w:pStyle w:val="IMG1"/>
+        <w:rPr/>
+      </w:pPr>
+      <w:r>
+        <w:rPr/>
+        <w:drawing>
+          <wp:inline distT="0" distB="0" distL="0" distR="0">
+            <wp:extent cx="6645910" cy="5532755"/>
+            <wp:effectExtent l="0" t="0" r="0" b="0"/>
+            <wp:docPr id="8" name="Зображення6"/>
+            <wp:cNvGraphicFramePr>
+              <a:graphicFrameLocks xmlns:a="http://schemas.openxmlformats.org/drawingml/2006/main" noChangeAspect="1"/>
+            </wp:cNvGraphicFramePr>
+            <a:graphic xmlns:a="http://schemas.openxmlformats.org/drawingml/2006/main">
+              <a:graphicData uri="http://schemas.openxmlformats.org/drawingml/2006/picture">
+                <pic:pic xmlns:pic="http://schemas.openxmlformats.org/drawingml/2006/picture">
+                  <pic:nvPicPr>
+                    <pic:cNvPr id="8" name="Зображення6"/>
+                    <pic:cNvPicPr>
+                      <a:picLocks noChangeAspect="1" noChangeArrowheads="1"/>
+                    </pic:cNvPicPr>
+                  </pic:nvPicPr>
+                  <pic:blipFill>
+                    <a:blip r:embed="rId9"/>
+                    <a:stretch>
+                      <a:fillRect/>
+                    </a:stretch>
+                  </pic:blipFill>
+                  <pic:spPr bwMode="auto">
+                    <a:xfrm>
+                      <a:off x="0" y="0"/>
+                      <a:ext cx="6645910" cy="5532755"/>
+                    </a:xfrm>
+                    <a:prstGeom prst="rect">
+                      <a:avLst/>
+                    </a:prstGeom>
+                    <a:noFill/>
+                  </pic:spPr>
+                </pic:pic>
+              </a:graphicData>
+            </a:graphic>
+          </wp:inline>
+        </w:drawing>
+      </w:r>
+    </w:p>
+    <w:p>
+      <w:pPr>
+        <w:pStyle w:val="IMG1"/>
+        <w:rPr/>
+      </w:pPr>
+      <w:r>
+        <w:rPr/>
+        <w:t xml:space="preserve">Рисунок </w:t>
+      </w:r>
+      <w:r>
+        <w:rPr>
+          <w:lang w:val="en-US"/>
+        </w:rPr>
+        <w:t>2</w:t>
+      </w:r>
+      <w:r>
+        <w:rPr/>
+        <w:t>.</w:t>
+      </w:r>
+      <w:r>
+        <w:rPr>
+          <w:lang w:val="en-US"/>
+        </w:rPr>
+        <w:t>7</w:t>
+      </w:r>
+      <w:r>
+        <w:rPr/>
+        <w:t xml:space="preserve"> — Модель </w:t>
+      </w:r>
+      <w:r>
+        <w:rPr>
+          <w:lang w:val="en-US"/>
+        </w:rPr>
+        <w:t>Lazy.IBk</w:t>
+      </w:r>
+    </w:p>
+    <w:p>
+      <w:pPr>
+        <w:pStyle w:val="p11"/>
+        <w:rPr>
+          <w:lang w:val="en-US"/>
+        </w:rPr>
+      </w:pPr>
+      <w:r>
+        <w:rPr>
+          <w:lang w:val="en-US"/>
+        </w:rPr>
+      </w:r>
+    </w:p>
+    <w:p>
+      <w:pPr>
+        <w:pStyle w:val="H2"/>
+        <w:rPr>
+          <w:b/>
+          <w:bCs/>
+        </w:rPr>
+      </w:pPr>
+      <w:r>
+        <w:rPr>
+          <w:b/>
+          <w:bCs/>
+          <w:i w:val="false"/>
+          <w:caps w:val="false"/>
+          <w:smallCaps w:val="false"/>
+          <w:spacing w:val="0"/>
+        </w:rPr>
+        <w:t xml:space="preserve">3 </w:t>
+      </w:r>
+      <w:r>
+        <w:rPr>
+          <w:b/>
+          <w:bCs/>
+          <w:i w:val="false"/>
+          <w:caps w:val="false"/>
+          <w:smallCaps w:val="false"/>
+          <w:spacing w:val="0"/>
+        </w:rPr>
+        <w:t>Д</w:t>
+      </w:r>
+      <w:r>
+        <w:rPr>
+          <w:b/>
+          <w:bCs/>
+          <w:i w:val="false"/>
+          <w:caps w:val="false"/>
+          <w:smallCaps w:val="false"/>
+          <w:spacing w:val="0"/>
+        </w:rPr>
+        <w:t>осягти найліпшої якості навчання різних</w:t>
+      </w:r>
+      <w:r>
+        <w:rPr>
+          <w:b/>
+          <w:bCs/>
+          <w:caps w:val="false"/>
+          <w:smallCaps w:val="false"/>
+          <w:spacing w:val="0"/>
+        </w:rPr>
+        <w:t xml:space="preserve"> </w:t>
+      </w:r>
+      <w:r>
+        <w:rPr>
+          <w:b/>
+          <w:bCs/>
+          <w:i w:val="false"/>
+          <w:caps w:val="false"/>
+          <w:smallCaps w:val="false"/>
+          <w:spacing w:val="0"/>
+        </w:rPr>
+        <w:t>класифікаторів</w:t>
+      </w:r>
+    </w:p>
+    <w:p>
+      <w:pPr>
+        <w:pStyle w:val="p11"/>
+        <w:rPr>
+          <w:lang w:val="en-US"/>
+        </w:rPr>
+      </w:pPr>
+      <w:r>
+        <w:rPr>
+          <w:lang w:val="en-US"/>
+        </w:rPr>
+      </w:r>
+    </w:p>
+    <w:p>
+      <w:pPr>
+        <w:pStyle w:val="p11"/>
+        <w:rPr>
+          <w:lang w:val="uk-UA"/>
+        </w:rPr>
+      </w:pPr>
+      <w:r>
+        <w:rPr>
+          <w:lang w:val="uk-UA"/>
+        </w:rPr>
+        <w:t>Після початкового використання методів було досягнено таку кількість правильних відповідей для кожного методу:</w:t>
+      </w:r>
+    </w:p>
+    <w:p>
+      <w:pPr>
+        <w:pStyle w:val="p11"/>
+        <w:rPr>
+          <w:lang w:val="uk-UA"/>
+        </w:rPr>
+      </w:pPr>
+      <w:r>
+        <w:rPr>
+          <w:lang w:val="uk-UA"/>
+        </w:rPr>
+      </w:r>
+      <w:r>
+        <w:br w:type="page"/>
+      </w:r>
+    </w:p>
+    <w:p>
+      <w:pPr>
+        <w:pStyle w:val="p11"/>
+        <w:rPr>
+          <w:lang w:val="uk-UA"/>
+        </w:rPr>
+      </w:pPr>
+      <w:r>
+        <w:rPr>
+          <w:lang w:val="uk-UA"/>
+        </w:rPr>
+        <w:t>Таблиця 1.1 — Кількості правильних відповідей</w:t>
+      </w:r>
+    </w:p>
+    <w:tbl>
+      <w:tblPr>
+        <w:tblW w:w="7021" w:type="dxa"/>
+        <w:jc w:val="left"/>
+        <w:tblInd w:w="55" w:type="dxa"/>
+        <w:tblLayout w:type="fixed"/>
+        <w:tblCellMar>
+          <w:top w:w="55" w:type="dxa"/>
+          <w:left w:w="55" w:type="dxa"/>
+          <w:bottom w:w="55" w:type="dxa"/>
+          <w:right w:w="55" w:type="dxa"/>
+        </w:tblCellMar>
+      </w:tblPr>
+      <w:tblGrid>
+        <w:gridCol w:w="412"/>
+        <w:gridCol w:w="2238"/>
+        <w:gridCol w:w="4371"/>
+      </w:tblGrid>
+      <w:tr>
+        <w:trPr/>
+        <w:tc>
+          <w:tcPr>
+            <w:tcW w:w="412" w:type="dxa"/>
+            <w:tcBorders>
+              <w:top w:val="single" w:sz="4" w:space="0" w:color="000000"/>
+              <w:left w:val="single" w:sz="4" w:space="0" w:color="000000"/>
+              <w:bottom w:val="single" w:sz="4" w:space="0" w:color="000000"/>
+            </w:tcBorders>
+          </w:tcPr>
+          <w:p>
+            <w:pPr>
+              <w:pStyle w:val="Style15"/>
+              <w:spacing w:lineRule="auto" w:line="240"/>
+              <w:ind w:hanging="0" w:left="0"/>
+              <w:rPr>
+                <w:b/>
+                <w:bCs/>
+                <w:lang w:val="uk-UA"/>
+              </w:rPr>
+            </w:pPr>
+            <w:r>
+              <w:rPr>
+                <w:b/>
+                <w:bCs/>
+                <w:lang w:val="uk-UA"/>
+              </w:rPr>
+              <w:t>№</w:t>
+            </w:r>
+          </w:p>
+        </w:tc>
+        <w:tc>
+          <w:tcPr>
+            <w:tcW w:w="2238" w:type="dxa"/>
+            <w:tcBorders>
+              <w:top w:val="single" w:sz="4" w:space="0" w:color="000000"/>
+              <w:left w:val="single" w:sz="4" w:space="0" w:color="000000"/>
+              <w:bottom w:val="single" w:sz="4" w:space="0" w:color="000000"/>
+            </w:tcBorders>
+          </w:tcPr>
+          <w:p>
+            <w:pPr>
+              <w:pStyle w:val="Style15"/>
+              <w:spacing w:lineRule="auto" w:line="240"/>
+              <w:ind w:hanging="0" w:left="0"/>
+              <w:rPr>
+                <w:b/>
+                <w:bCs/>
+              </w:rPr>
+            </w:pPr>
+            <w:r>
+              <w:rPr>
+                <w:b/>
+                <w:bCs/>
+              </w:rPr>
+              <w:t>Метод</w:t>
+            </w:r>
+          </w:p>
+        </w:tc>
+        <w:tc>
+          <w:tcPr>
+            <w:tcW w:w="4371" w:type="dxa"/>
+            <w:tcBorders>
+              <w:top w:val="single" w:sz="4" w:space="0" w:color="000000"/>
+              <w:left w:val="single" w:sz="4" w:space="0" w:color="000000"/>
+              <w:bottom w:val="single" w:sz="4" w:space="0" w:color="000000"/>
+              <w:right w:val="single" w:sz="4" w:space="0" w:color="000000"/>
+            </w:tcBorders>
+          </w:tcPr>
+          <w:p>
+            <w:pPr>
+              <w:pStyle w:val="Style15"/>
+              <w:spacing w:lineRule="auto" w:line="240"/>
+              <w:ind w:hanging="0" w:left="0"/>
+              <w:rPr>
+                <w:b/>
+                <w:bCs/>
+              </w:rPr>
+            </w:pPr>
+            <w:r>
+              <w:rPr>
+                <w:b/>
+                <w:bCs/>
+              </w:rPr>
+              <w:t>Кількість правильних відповідей</w:t>
+            </w:r>
+          </w:p>
+        </w:tc>
+      </w:tr>
+      <w:tr>
+        <w:trPr/>
+        <w:tc>
+          <w:tcPr>
+            <w:tcW w:w="412" w:type="dxa"/>
+            <w:tcBorders>
+              <w:left w:val="single" w:sz="4" w:space="0" w:color="000000"/>
+              <w:bottom w:val="single" w:sz="4" w:space="0" w:color="000000"/>
+            </w:tcBorders>
+          </w:tcPr>
+          <w:p>
+            <w:pPr>
+              <w:pStyle w:val="Style15"/>
+              <w:spacing w:lineRule="auto" w:line="240"/>
+              <w:ind w:hanging="0" w:left="0"/>
+              <w:rPr>
+                <w:b w:val="false"/>
+                <w:bCs w:val="false"/>
+                <w:lang w:val="uk-UA"/>
+              </w:rPr>
+            </w:pPr>
+            <w:r>
+              <w:rPr>
+                <w:b w:val="false"/>
+                <w:bCs w:val="false"/>
+                <w:lang w:val="uk-UA"/>
+              </w:rPr>
+              <w:t>1</w:t>
+            </w:r>
+          </w:p>
+        </w:tc>
+        <w:tc>
+          <w:tcPr>
+            <w:tcW w:w="2238" w:type="dxa"/>
+            <w:tcBorders>
+              <w:left w:val="single" w:sz="4" w:space="0" w:color="000000"/>
+              <w:bottom w:val="single" w:sz="4" w:space="0" w:color="000000"/>
+            </w:tcBorders>
+          </w:tcPr>
+          <w:p>
+            <w:pPr>
+              <w:pStyle w:val="Style15"/>
+              <w:spacing w:lineRule="auto" w:line="240"/>
+              <w:ind w:hanging="0" w:left="0"/>
+              <w:rPr>
+                <w:b w:val="false"/>
+                <w:bCs w:val="false"/>
+                <w:lang w:val="en-US"/>
+              </w:rPr>
+            </w:pPr>
+            <w:r>
+              <w:rPr>
+                <w:b w:val="false"/>
+                <w:bCs w:val="false"/>
+                <w:lang w:val="en-US"/>
+              </w:rPr>
+              <w:t>Rules.ZeroR</w:t>
+            </w:r>
+          </w:p>
+        </w:tc>
+        <w:tc>
+          <w:tcPr>
+            <w:tcW w:w="4371" w:type="dxa"/>
+            <w:tcBorders>
+              <w:left w:val="single" w:sz="4" w:space="0" w:color="000000"/>
+              <w:bottom w:val="single" w:sz="4" w:space="0" w:color="000000"/>
+              <w:right w:val="single" w:sz="4" w:space="0" w:color="000000"/>
+            </w:tcBorders>
+          </w:tcPr>
+          <w:p>
+            <w:pPr>
+              <w:pStyle w:val="Style15"/>
+              <w:spacing w:lineRule="auto" w:line="240"/>
+              <w:ind w:hanging="0" w:left="0"/>
+              <w:rPr>
+                <w:b w:val="false"/>
+                <w:bCs w:val="false"/>
+                <w:lang w:val="en-US"/>
+              </w:rPr>
+            </w:pPr>
+            <w:r>
+              <w:rPr>
+                <w:b w:val="false"/>
+                <w:bCs w:val="false"/>
+                <w:lang w:val="en-US"/>
+              </w:rPr>
+              <w:t>600</w:t>
+            </w:r>
+          </w:p>
+        </w:tc>
+      </w:tr>
+      <w:tr>
+        <w:trPr/>
+        <w:tc>
+          <w:tcPr>
+            <w:tcW w:w="412" w:type="dxa"/>
+            <w:tcBorders>
+              <w:left w:val="single" w:sz="4" w:space="0" w:color="000000"/>
+              <w:bottom w:val="single" w:sz="4" w:space="0" w:color="000000"/>
+            </w:tcBorders>
+          </w:tcPr>
+          <w:p>
+            <w:pPr>
+              <w:pStyle w:val="Style15"/>
+              <w:spacing w:lineRule="auto" w:line="240"/>
+              <w:ind w:hanging="0" w:left="0"/>
+              <w:rPr>
+                <w:b w:val="false"/>
+                <w:bCs w:val="false"/>
+                <w:lang w:val="uk-UA"/>
+              </w:rPr>
+            </w:pPr>
+            <w:r>
+              <w:rPr>
+                <w:b w:val="false"/>
+                <w:bCs w:val="false"/>
+                <w:lang w:val="uk-UA"/>
+              </w:rPr>
+              <w:t>2</w:t>
+            </w:r>
+          </w:p>
+        </w:tc>
+        <w:tc>
+          <w:tcPr>
+            <w:tcW w:w="2238" w:type="dxa"/>
+            <w:tcBorders>
+              <w:left w:val="single" w:sz="4" w:space="0" w:color="000000"/>
+              <w:bottom w:val="single" w:sz="4" w:space="0" w:color="000000"/>
+            </w:tcBorders>
+          </w:tcPr>
+          <w:p>
+            <w:pPr>
+              <w:pStyle w:val="Style15"/>
+              <w:spacing w:lineRule="auto" w:line="240"/>
+              <w:ind w:hanging="0" w:left="0"/>
+              <w:rPr>
+                <w:b w:val="false"/>
+                <w:bCs w:val="false"/>
+                <w:lang w:val="en-US"/>
+              </w:rPr>
+            </w:pPr>
+            <w:r>
+              <w:rPr>
+                <w:b w:val="false"/>
+                <w:bCs w:val="false"/>
+                <w:lang w:val="en-US"/>
+              </w:rPr>
+              <w:t>Rules.OneR</w:t>
+            </w:r>
+          </w:p>
+        </w:tc>
+        <w:tc>
+          <w:tcPr>
+            <w:tcW w:w="4371" w:type="dxa"/>
+            <w:tcBorders>
+              <w:left w:val="single" w:sz="4" w:space="0" w:color="000000"/>
+              <w:bottom w:val="single" w:sz="4" w:space="0" w:color="000000"/>
+              <w:right w:val="single" w:sz="4" w:space="0" w:color="000000"/>
+            </w:tcBorders>
+          </w:tcPr>
+          <w:p>
+            <w:pPr>
+              <w:pStyle w:val="Style15"/>
+              <w:spacing w:lineRule="auto" w:line="240"/>
+              <w:ind w:hanging="0" w:left="0"/>
+              <w:rPr>
+                <w:b w:val="false"/>
+                <w:bCs w:val="false"/>
+                <w:lang w:val="en-US"/>
+              </w:rPr>
+            </w:pPr>
+            <w:r>
+              <w:rPr>
+                <w:b w:val="false"/>
+                <w:bCs w:val="false"/>
+                <w:lang w:val="en-US"/>
+              </w:rPr>
+              <w:t>600</w:t>
+            </w:r>
+          </w:p>
+        </w:tc>
+      </w:tr>
+      <w:tr>
+        <w:trPr/>
+        <w:tc>
+          <w:tcPr>
+            <w:tcW w:w="412" w:type="dxa"/>
+            <w:tcBorders>
+              <w:left w:val="single" w:sz="4" w:space="0" w:color="000000"/>
+              <w:bottom w:val="single" w:sz="4" w:space="0" w:color="000000"/>
+            </w:tcBorders>
+          </w:tcPr>
+          <w:p>
+            <w:pPr>
+              <w:pStyle w:val="Style15"/>
+              <w:spacing w:lineRule="auto" w:line="240"/>
+              <w:ind w:hanging="0" w:left="0"/>
+              <w:rPr>
+                <w:b w:val="false"/>
+                <w:bCs w:val="false"/>
+                <w:lang w:val="uk-UA"/>
+              </w:rPr>
+            </w:pPr>
+            <w:r>
+              <w:rPr>
+                <w:b w:val="false"/>
+                <w:bCs w:val="false"/>
+                <w:lang w:val="uk-UA"/>
+              </w:rPr>
+              <w:t>3</w:t>
+            </w:r>
+          </w:p>
+        </w:tc>
+        <w:tc>
+          <w:tcPr>
+            <w:tcW w:w="2238" w:type="dxa"/>
+            <w:tcBorders>
+              <w:left w:val="single" w:sz="4" w:space="0" w:color="000000"/>
+              <w:bottom w:val="single" w:sz="4" w:space="0" w:color="000000"/>
+            </w:tcBorders>
+          </w:tcPr>
+          <w:p>
+            <w:pPr>
+              <w:pStyle w:val="Style15"/>
+              <w:spacing w:lineRule="auto" w:line="240"/>
+              <w:ind w:hanging="0" w:left="0"/>
+              <w:rPr>
+                <w:b w:val="false"/>
+                <w:bCs w:val="false"/>
+                <w:lang w:val="en-US"/>
+              </w:rPr>
+            </w:pPr>
+            <w:r>
+              <w:rPr>
+                <w:b w:val="false"/>
+                <w:bCs w:val="false"/>
+                <w:lang w:val="en-US"/>
+              </w:rPr>
+              <w:t>Rules.Prism</w:t>
+            </w:r>
+          </w:p>
+        </w:tc>
+        <w:tc>
+          <w:tcPr>
+            <w:tcW w:w="4371" w:type="dxa"/>
+            <w:tcBorders>
+              <w:left w:val="single" w:sz="4" w:space="0" w:color="000000"/>
+              <w:bottom w:val="single" w:sz="4" w:space="0" w:color="000000"/>
+              <w:right w:val="single" w:sz="4" w:space="0" w:color="000000"/>
+            </w:tcBorders>
+          </w:tcPr>
+          <w:p>
+            <w:pPr>
+              <w:pStyle w:val="Style15"/>
+              <w:spacing w:lineRule="auto" w:line="240"/>
+              <w:ind w:hanging="0" w:left="0"/>
+              <w:rPr>
+                <w:b w:val="false"/>
+                <w:bCs w:val="false"/>
+                <w:lang w:val="uk-UA"/>
+              </w:rPr>
+            </w:pPr>
+            <w:r>
+              <w:rPr>
+                <w:b w:val="false"/>
+                <w:bCs w:val="false"/>
+                <w:lang w:val="uk-UA"/>
+              </w:rPr>
+              <w:t>600</w:t>
+            </w:r>
+          </w:p>
+        </w:tc>
+      </w:tr>
+      <w:tr>
+        <w:trPr/>
+        <w:tc>
+          <w:tcPr>
+            <w:tcW w:w="412" w:type="dxa"/>
+            <w:tcBorders>
+              <w:left w:val="single" w:sz="4" w:space="0" w:color="000000"/>
+              <w:bottom w:val="single" w:sz="4" w:space="0" w:color="000000"/>
+            </w:tcBorders>
+          </w:tcPr>
+          <w:p>
+            <w:pPr>
+              <w:pStyle w:val="Style15"/>
+              <w:spacing w:lineRule="auto" w:line="240"/>
+              <w:ind w:hanging="0" w:left="0"/>
+              <w:rPr>
+                <w:b w:val="false"/>
+                <w:bCs w:val="false"/>
+                <w:lang w:val="uk-UA"/>
+              </w:rPr>
+            </w:pPr>
+            <w:r>
+              <w:rPr>
+                <w:b w:val="false"/>
+                <w:bCs w:val="false"/>
+                <w:lang w:val="uk-UA"/>
+              </w:rPr>
+              <w:t>4</w:t>
+            </w:r>
+          </w:p>
+        </w:tc>
+        <w:tc>
+          <w:tcPr>
+            <w:tcW w:w="2238" w:type="dxa"/>
+            <w:tcBorders>
+              <w:left w:val="single" w:sz="4" w:space="0" w:color="000000"/>
+              <w:bottom w:val="single" w:sz="4" w:space="0" w:color="000000"/>
+            </w:tcBorders>
+          </w:tcPr>
+          <w:p>
+            <w:pPr>
+              <w:pStyle w:val="Style15"/>
+              <w:spacing w:lineRule="auto" w:line="240"/>
+              <w:ind w:hanging="0" w:left="0"/>
+              <w:rPr>
+                <w:b w:val="false"/>
+                <w:bCs w:val="false"/>
+                <w:lang w:val="en-US"/>
+              </w:rPr>
+            </w:pPr>
+            <w:r>
+              <w:rPr>
+                <w:b w:val="false"/>
+                <w:bCs w:val="false"/>
+                <w:lang w:val="en-US"/>
+              </w:rPr>
+              <w:t>Bayes.NaiveBayes</w:t>
+            </w:r>
+          </w:p>
+        </w:tc>
+        <w:tc>
+          <w:tcPr>
+            <w:tcW w:w="4371" w:type="dxa"/>
+            <w:tcBorders>
+              <w:left w:val="single" w:sz="4" w:space="0" w:color="000000"/>
+              <w:bottom w:val="single" w:sz="4" w:space="0" w:color="000000"/>
+              <w:right w:val="single" w:sz="4" w:space="0" w:color="000000"/>
+            </w:tcBorders>
+          </w:tcPr>
+          <w:p>
+            <w:pPr>
+              <w:pStyle w:val="Style15"/>
+              <w:spacing w:lineRule="auto" w:line="240"/>
+              <w:ind w:hanging="0" w:left="0"/>
+              <w:rPr>
+                <w:b w:val="false"/>
+                <w:bCs w:val="false"/>
+                <w:lang w:val="en-US"/>
+              </w:rPr>
+            </w:pPr>
+            <w:r>
+              <w:rPr>
+                <w:b w:val="false"/>
+                <w:bCs w:val="false"/>
+                <w:lang w:val="en-US"/>
+              </w:rPr>
+              <w:t>600</w:t>
+            </w:r>
+          </w:p>
+        </w:tc>
+      </w:tr>
+      <w:tr>
+        <w:trPr/>
+        <w:tc>
+          <w:tcPr>
+            <w:tcW w:w="412" w:type="dxa"/>
+            <w:tcBorders>
+              <w:left w:val="single" w:sz="4" w:space="0" w:color="000000"/>
+              <w:bottom w:val="single" w:sz="4" w:space="0" w:color="000000"/>
+            </w:tcBorders>
+          </w:tcPr>
+          <w:p>
+            <w:pPr>
+              <w:pStyle w:val="Style15"/>
+              <w:spacing w:lineRule="auto" w:line="240"/>
+              <w:ind w:hanging="0" w:left="0"/>
+              <w:rPr>
+                <w:b w:val="false"/>
+                <w:bCs w:val="false"/>
+                <w:lang w:val="en-US"/>
+              </w:rPr>
+            </w:pPr>
+            <w:r>
+              <w:rPr>
+                <w:b w:val="false"/>
+                <w:bCs w:val="false"/>
+                <w:lang w:val="en-US"/>
+              </w:rPr>
+              <w:t>5</w:t>
+            </w:r>
+          </w:p>
+        </w:tc>
+        <w:tc>
+          <w:tcPr>
+            <w:tcW w:w="2238" w:type="dxa"/>
+            <w:tcBorders>
+              <w:left w:val="single" w:sz="4" w:space="0" w:color="000000"/>
+              <w:bottom w:val="single" w:sz="4" w:space="0" w:color="000000"/>
+            </w:tcBorders>
+          </w:tcPr>
+          <w:p>
+            <w:pPr>
+              <w:pStyle w:val="Style15"/>
+              <w:spacing w:lineRule="auto" w:line="240"/>
+              <w:ind w:hanging="0" w:left="0"/>
+              <w:rPr>
+                <w:b w:val="false"/>
+                <w:bCs w:val="false"/>
+                <w:lang w:val="en-US"/>
+              </w:rPr>
+            </w:pPr>
+            <w:r>
+              <w:rPr>
+                <w:b w:val="false"/>
+                <w:bCs w:val="false"/>
+                <w:lang w:val="en-US"/>
+              </w:rPr>
+              <w:t>Trees.J48</w:t>
+            </w:r>
+          </w:p>
+        </w:tc>
+        <w:tc>
+          <w:tcPr>
+            <w:tcW w:w="4371" w:type="dxa"/>
+            <w:tcBorders>
+              <w:left w:val="single" w:sz="4" w:space="0" w:color="000000"/>
+              <w:bottom w:val="single" w:sz="4" w:space="0" w:color="000000"/>
+              <w:right w:val="single" w:sz="4" w:space="0" w:color="000000"/>
+            </w:tcBorders>
+          </w:tcPr>
+          <w:p>
+            <w:pPr>
+              <w:pStyle w:val="Style15"/>
+              <w:spacing w:lineRule="auto" w:line="240"/>
+              <w:ind w:hanging="0" w:left="0"/>
+              <w:rPr>
+                <w:b w:val="false"/>
+                <w:bCs w:val="false"/>
+                <w:lang w:val="uk-UA"/>
+              </w:rPr>
+            </w:pPr>
+            <w:r>
+              <w:rPr>
+                <w:b w:val="false"/>
+                <w:bCs w:val="false"/>
+                <w:lang w:val="uk-UA"/>
+              </w:rPr>
+              <w:t>600</w:t>
+            </w:r>
+          </w:p>
+        </w:tc>
+      </w:tr>
+      <w:tr>
+        <w:trPr/>
+        <w:tc>
+          <w:tcPr>
+            <w:tcW w:w="412" w:type="dxa"/>
+            <w:tcBorders>
+              <w:left w:val="single" w:sz="4" w:space="0" w:color="000000"/>
+              <w:bottom w:val="single" w:sz="4" w:space="0" w:color="000000"/>
+            </w:tcBorders>
+          </w:tcPr>
+          <w:p>
+            <w:pPr>
+              <w:pStyle w:val="Style15"/>
+              <w:spacing w:lineRule="auto" w:line="240"/>
+              <w:ind w:hanging="0" w:left="0"/>
+              <w:rPr>
+                <w:b w:val="false"/>
+                <w:bCs w:val="false"/>
+                <w:lang w:val="en-US"/>
+              </w:rPr>
+            </w:pPr>
+            <w:r>
+              <w:rPr>
+                <w:b w:val="false"/>
+                <w:bCs w:val="false"/>
+                <w:lang w:val="en-US"/>
+              </w:rPr>
+              <w:t>6</w:t>
+            </w:r>
+          </w:p>
+        </w:tc>
+        <w:tc>
+          <w:tcPr>
+            <w:tcW w:w="2238" w:type="dxa"/>
+            <w:tcBorders>
+              <w:left w:val="single" w:sz="4" w:space="0" w:color="000000"/>
+              <w:bottom w:val="single" w:sz="4" w:space="0" w:color="000000"/>
+            </w:tcBorders>
+          </w:tcPr>
+          <w:p>
+            <w:pPr>
+              <w:pStyle w:val="Style15"/>
+              <w:spacing w:lineRule="auto" w:line="240"/>
+              <w:ind w:hanging="0" w:left="0"/>
+              <w:rPr>
+                <w:b w:val="false"/>
+                <w:bCs w:val="false"/>
+                <w:lang w:val="en-US"/>
+              </w:rPr>
+            </w:pPr>
+            <w:r>
+              <w:rPr>
+                <w:b w:val="false"/>
+                <w:bCs w:val="false"/>
+                <w:lang w:val="en-US"/>
+              </w:rPr>
+              <w:t>Functions.SMO</w:t>
+            </w:r>
+          </w:p>
+        </w:tc>
+        <w:tc>
+          <w:tcPr>
+            <w:tcW w:w="4371" w:type="dxa"/>
+            <w:tcBorders>
+              <w:left w:val="single" w:sz="4" w:space="0" w:color="000000"/>
+              <w:bottom w:val="single" w:sz="4" w:space="0" w:color="000000"/>
+              <w:right w:val="single" w:sz="4" w:space="0" w:color="000000"/>
+            </w:tcBorders>
+          </w:tcPr>
+          <w:p>
+            <w:pPr>
+              <w:pStyle w:val="Style15"/>
+              <w:spacing w:lineRule="auto" w:line="240"/>
+              <w:ind w:hanging="0" w:left="0"/>
+              <w:rPr>
+                <w:b w:val="false"/>
+                <w:bCs w:val="false"/>
+                <w:lang w:val="uk-UA"/>
+              </w:rPr>
+            </w:pPr>
+            <w:r>
+              <w:rPr>
+                <w:b w:val="false"/>
+                <w:bCs w:val="false"/>
+                <w:lang w:val="uk-UA"/>
+              </w:rPr>
+              <w:t>600</w:t>
+            </w:r>
+          </w:p>
+        </w:tc>
+      </w:tr>
+      <w:tr>
+        <w:trPr/>
+        <w:tc>
+          <w:tcPr>
+            <w:tcW w:w="412" w:type="dxa"/>
+            <w:tcBorders>
+              <w:left w:val="single" w:sz="4" w:space="0" w:color="000000"/>
+              <w:bottom w:val="single" w:sz="4" w:space="0" w:color="000000"/>
+            </w:tcBorders>
+          </w:tcPr>
+          <w:p>
+            <w:pPr>
+              <w:pStyle w:val="Style15"/>
+              <w:spacing w:lineRule="auto" w:line="240"/>
+              <w:ind w:hanging="0" w:left="0"/>
+              <w:rPr>
+                <w:b w:val="false"/>
+                <w:bCs w:val="false"/>
+                <w:lang w:val="en-US"/>
+              </w:rPr>
+            </w:pPr>
+            <w:r>
+              <w:rPr>
+                <w:b w:val="false"/>
+                <w:bCs w:val="false"/>
+                <w:lang w:val="en-US"/>
+              </w:rPr>
+              <w:t>7</w:t>
+            </w:r>
+          </w:p>
+        </w:tc>
+        <w:tc>
+          <w:tcPr>
+            <w:tcW w:w="2238" w:type="dxa"/>
+            <w:tcBorders>
+              <w:left w:val="single" w:sz="4" w:space="0" w:color="000000"/>
+              <w:bottom w:val="single" w:sz="4" w:space="0" w:color="000000"/>
+            </w:tcBorders>
+          </w:tcPr>
+          <w:p>
+            <w:pPr>
+              <w:pStyle w:val="Style15"/>
+              <w:spacing w:lineRule="auto" w:line="240"/>
+              <w:ind w:hanging="0" w:left="0"/>
+              <w:rPr>
+                <w:b w:val="false"/>
+                <w:bCs w:val="false"/>
+                <w:lang w:val="en-US"/>
+              </w:rPr>
+            </w:pPr>
+            <w:r>
+              <w:rPr>
+                <w:b w:val="false"/>
+                <w:bCs w:val="false"/>
+                <w:lang w:val="en-US"/>
+              </w:rPr>
+              <w:t>Lazy.IBk</w:t>
+            </w:r>
+          </w:p>
+        </w:tc>
+        <w:tc>
+          <w:tcPr>
+            <w:tcW w:w="4371" w:type="dxa"/>
+            <w:tcBorders>
+              <w:left w:val="single" w:sz="4" w:space="0" w:color="000000"/>
+              <w:bottom w:val="single" w:sz="4" w:space="0" w:color="000000"/>
+              <w:right w:val="single" w:sz="4" w:space="0" w:color="000000"/>
+            </w:tcBorders>
+          </w:tcPr>
+          <w:p>
+            <w:pPr>
+              <w:pStyle w:val="Style15"/>
+              <w:spacing w:lineRule="auto" w:line="240"/>
+              <w:ind w:hanging="0" w:left="0"/>
+              <w:rPr>
+                <w:b w:val="false"/>
+                <w:bCs w:val="false"/>
+                <w:lang w:val="uk-UA"/>
+              </w:rPr>
+            </w:pPr>
+            <w:r>
+              <w:rPr>
+                <w:b w:val="false"/>
+                <w:bCs w:val="false"/>
+                <w:lang w:val="uk-UA"/>
+              </w:rPr>
+              <w:t>600</w:t>
+            </w:r>
+          </w:p>
+        </w:tc>
+      </w:tr>
+    </w:tbl>
+    <w:p>
+      <w:pPr>
+        <w:pStyle w:val="p11"/>
+        <w:rPr/>
+      </w:pPr>
+      <w:r>
+        <w:rPr/>
+      </w:r>
+    </w:p>
+    <w:p>
+      <w:pPr>
+        <w:pStyle w:val="H3"/>
+        <w:rPr/>
+      </w:pPr>
+      <w:r>
+        <w:rPr/>
+        <w:t>3.2 Rules.OneR</w:t>
+      </w:r>
+    </w:p>
+    <w:p>
+      <w:pPr>
+        <w:pStyle w:val="P1"/>
+        <w:rPr/>
+      </w:pPr>
+      <w:r>
+        <w:rPr/>
+      </w:r>
+    </w:p>
+    <w:p>
+      <w:pPr>
+        <w:pStyle w:val="P1"/>
+        <w:rPr/>
+      </w:pPr>
+      <w:r>
+        <w:rPr/>
+        <w:t>При встановленні M</w:t>
+      </w:r>
+      <w:r>
+        <w:rPr>
+          <w:lang w:val="en-US"/>
+        </w:rPr>
+        <w:t xml:space="preserve">in Bucket Size </w:t>
+      </w:r>
+      <w:r>
+        <w:rPr>
+          <w:lang w:val="uk-UA"/>
+        </w:rPr>
+        <w:t>у 3 все одно результат максимальний — 600 правильно визначених екземплярів.</w:t>
+      </w:r>
+    </w:p>
+    <w:p>
+      <w:pPr>
+        <w:pStyle w:val="P1"/>
+        <w:rPr>
+          <w:lang w:val="uk-UA"/>
+        </w:rPr>
+      </w:pPr>
+      <w:r>
+        <w:rPr>
+          <w:lang w:val="uk-UA"/>
+        </w:rPr>
+        <w:t>Деталі на рисунку нижче:</w:t>
+      </w:r>
+    </w:p>
+    <w:p>
+      <w:pPr>
+        <w:pStyle w:val="IMG1"/>
+        <w:rPr/>
+      </w:pPr>
+      <w:r>
+        <w:rPr/>
+      </w:r>
+    </w:p>
+    <w:p>
+      <w:pPr>
+        <w:pStyle w:val="IMG1"/>
+        <w:rPr/>
+      </w:pPr>
+      <w:r>
+        <w:rPr/>
+        <w:drawing>
+          <wp:inline distT="0" distB="0" distL="0" distR="0">
+            <wp:extent cx="5238115" cy="3636645"/>
+            <wp:effectExtent l="0" t="0" r="0" b="0"/>
+            <wp:docPr id="9" name="Зображення10"/>
+            <wp:cNvGraphicFramePr>
+              <a:graphicFrameLocks xmlns:a="http://schemas.openxmlformats.org/drawingml/2006/main" noChangeAspect="1"/>
+            </wp:cNvGraphicFramePr>
+            <a:graphic xmlns:a="http://schemas.openxmlformats.org/drawingml/2006/main">
+              <a:graphicData uri="http://schemas.openxmlformats.org/drawingml/2006/picture">
+                <pic:pic xmlns:pic="http://schemas.openxmlformats.org/drawingml/2006/picture">
+                  <pic:nvPicPr>
+                    <pic:cNvPr id="9" name="Зображення10"/>
+                    <pic:cNvPicPr>
+                      <a:picLocks noChangeAspect="1" noChangeArrowheads="1"/>
+                    </pic:cNvPicPr>
+                  </pic:nvPicPr>
+                  <pic:blipFill>
+                    <a:blip r:embed="rId10"/>
+                    <a:stretch>
+                      <a:fillRect/>
+                    </a:stretch>
+                  </pic:blipFill>
+                  <pic:spPr bwMode="auto">
+                    <a:xfrm>
+                      <a:off x="0" y="0"/>
+                      <a:ext cx="5238115" cy="3636645"/>
+                    </a:xfrm>
+                    <a:prstGeom prst="rect">
+                      <a:avLst/>
+                    </a:prstGeom>
+                    <a:noFill/>
+                  </pic:spPr>
+                </pic:pic>
+              </a:graphicData>
+            </a:graphic>
+          </wp:inline>
+        </w:drawing>
+      </w:r>
+    </w:p>
+    <w:p>
+      <w:pPr>
+        <w:pStyle w:val="IMG1"/>
+        <w:rPr/>
+      </w:pPr>
+      <w:r>
+        <w:rPr/>
+        <w:t>Рисунок 3.1 — Результати зі зміненими параметрами</w:t>
+      </w:r>
+    </w:p>
+    <w:p>
+      <w:pPr>
+        <w:pStyle w:val="P1"/>
+        <w:rPr/>
+      </w:pPr>
+      <w:r>
+        <w:rPr/>
+      </w:r>
+    </w:p>
+    <w:p>
+      <w:pPr>
+        <w:pStyle w:val="H3"/>
+        <w:rPr/>
+      </w:pPr>
+      <w:r>
+        <w:rPr/>
+        <w:t>3.6 Trees.J48</w:t>
+      </w:r>
+    </w:p>
+    <w:p>
+      <w:pPr>
+        <w:pStyle w:val="P1"/>
+        <w:rPr/>
+      </w:pPr>
+      <w:r>
+        <w:rPr/>
+      </w:r>
+    </w:p>
+    <w:p>
+      <w:pPr>
+        <w:pStyle w:val="P1"/>
+        <w:rPr>
+          <w:lang w:val="uk-UA"/>
+        </w:rPr>
+      </w:pPr>
+      <w:r>
+        <w:rPr>
+          <w:lang w:val="uk-UA"/>
+        </w:rPr>
+        <w:t>Встановивши параметри:</w:t>
+      </w:r>
+    </w:p>
+    <w:p>
+      <w:pPr>
+        <w:pStyle w:val="P1"/>
+        <w:rPr>
+          <w:lang w:val="uk-UA"/>
+        </w:rPr>
+      </w:pPr>
+      <w:r>
+        <w:rPr>
+          <w:lang w:val="uk-UA"/>
+        </w:rPr>
+        <w:t xml:space="preserve">- </w:t>
+      </w:r>
+      <w:r>
+        <w:rPr>
+          <w:lang w:val="en-US"/>
+        </w:rPr>
+        <w:t>confidenceFactor – 0.3;</w:t>
+      </w:r>
+    </w:p>
+    <w:p>
+      <w:pPr>
+        <w:pStyle w:val="P1"/>
+        <w:rPr>
+          <w:lang w:val="en-US"/>
+        </w:rPr>
+      </w:pPr>
+      <w:r>
+        <w:rPr>
+          <w:lang w:val="en-US"/>
+        </w:rPr>
+        <w:t>- minNumObj – 1.</w:t>
+      </w:r>
+    </w:p>
+    <w:p>
+      <w:pPr>
+        <w:pStyle w:val="P1"/>
+        <w:rPr>
+          <w:lang w:val="uk-UA"/>
+        </w:rPr>
+      </w:pPr>
+      <w:r>
+        <w:rPr>
+          <w:lang w:val="uk-UA"/>
+        </w:rPr>
+        <w:t>Отримано такі результати, деталі на рисунку:</w:t>
+      </w:r>
+    </w:p>
+    <w:p>
+      <w:pPr>
+        <w:pStyle w:val="IMG1"/>
+        <w:rPr/>
+      </w:pPr>
+      <w:r>
+        <w:rPr/>
+      </w:r>
+    </w:p>
+    <w:p>
+      <w:pPr>
+        <w:pStyle w:val="IMG1"/>
+        <w:rPr/>
+      </w:pPr>
+      <w:r>
+        <w:rPr/>
+        <w:drawing>
+          <wp:inline distT="0" distB="0" distL="0" distR="0">
+            <wp:extent cx="6645910" cy="4614545"/>
+            <wp:effectExtent l="0" t="0" r="0" b="0"/>
+            <wp:docPr id="10" name="Зображення11"/>
+            <wp:cNvGraphicFramePr>
+              <a:graphicFrameLocks xmlns:a="http://schemas.openxmlformats.org/drawingml/2006/main" noChangeAspect="1"/>
+            </wp:cNvGraphicFramePr>
+            <a:graphic xmlns:a="http://schemas.openxmlformats.org/drawingml/2006/main">
+              <a:graphicData uri="http://schemas.openxmlformats.org/drawingml/2006/picture">
+                <pic:pic xmlns:pic="http://schemas.openxmlformats.org/drawingml/2006/picture">
+                  <pic:nvPicPr>
+                    <pic:cNvPr id="10" name="Зображення11"/>
+                    <pic:cNvPicPr>
+                      <a:picLocks noChangeAspect="1" noChangeArrowheads="1"/>
+                    </pic:cNvPicPr>
+                  </pic:nvPicPr>
+                  <pic:blipFill>
+                    <a:blip r:embed="rId11"/>
+                    <a:stretch>
+                      <a:fillRect/>
+                    </a:stretch>
+                  </pic:blipFill>
+                  <pic:spPr bwMode="auto">
+                    <a:xfrm>
+                      <a:off x="0" y="0"/>
+                      <a:ext cx="6645910" cy="4614545"/>
+                    </a:xfrm>
+                    <a:prstGeom prst="rect">
+                      <a:avLst/>
+                    </a:prstGeom>
+                    <a:noFill/>
+                  </pic:spPr>
+                </pic:pic>
+              </a:graphicData>
+            </a:graphic>
+          </wp:inline>
+        </w:drawing>
+      </w:r>
+    </w:p>
+    <w:p>
+      <w:pPr>
+        <w:pStyle w:val="IMG1"/>
+        <w:rPr/>
+      </w:pPr>
+      <w:r>
+        <w:rPr/>
+        <w:t>Рисунок 3.2 — Модель при виконанні</w:t>
+      </w:r>
+    </w:p>
+    <w:p>
+      <w:pPr>
+        <w:pStyle w:val="P1"/>
+        <w:rPr/>
+      </w:pPr>
+      <w:r>
+        <w:rPr/>
+      </w:r>
+    </w:p>
+    <w:p>
+      <w:pPr>
+        <w:pStyle w:val="H3"/>
+        <w:rPr/>
+      </w:pPr>
+      <w:r>
+        <w:rPr/>
+        <w:t>3.7 Functions.SMO</w:t>
+      </w:r>
+    </w:p>
+    <w:p>
+      <w:pPr>
+        <w:pStyle w:val="P1"/>
+        <w:rPr/>
+      </w:pPr>
+      <w:r>
+        <w:rPr/>
+      </w:r>
+    </w:p>
+    <w:p>
+      <w:pPr>
+        <w:pStyle w:val="P1"/>
+        <w:rPr>
+          <w:lang w:val="uk-UA"/>
+        </w:rPr>
+      </w:pPr>
+      <w:r>
+        <w:rPr>
+          <w:lang w:val="uk-UA"/>
+        </w:rPr>
+        <w:t>Встановивши параметри:</w:t>
+      </w:r>
+    </w:p>
+    <w:p>
+      <w:pPr>
+        <w:pStyle w:val="P1"/>
+        <w:rPr>
+          <w:lang w:val="uk-UA"/>
+        </w:rPr>
+      </w:pPr>
+      <w:r>
+        <w:rPr>
+          <w:lang w:val="uk-UA"/>
+        </w:rPr>
+        <w:t xml:space="preserve">- </w:t>
+      </w:r>
+      <w:r>
+        <w:rPr>
+          <w:lang w:val="en-US"/>
+        </w:rPr>
+        <w:t>c: 3.0;</w:t>
+      </w:r>
+    </w:p>
+    <w:p>
+      <w:pPr>
+        <w:pStyle w:val="P1"/>
+        <w:rPr>
+          <w:lang w:val="en-US"/>
+        </w:rPr>
+      </w:pPr>
+      <w:r>
+        <w:rPr>
+          <w:lang w:val="en-US"/>
+        </w:rPr>
+        <w:t>- toleranceParameter: 0.1.</w:t>
+      </w:r>
+    </w:p>
+    <w:p>
+      <w:pPr>
+        <w:pStyle w:val="P1"/>
+        <w:rPr>
+          <w:lang w:val="uk-UA"/>
+        </w:rPr>
+      </w:pPr>
+      <w:r>
+        <w:rPr>
+          <w:lang w:val="uk-UA"/>
+        </w:rPr>
+        <w:t>Отримано такі результати:</w:t>
+      </w:r>
+    </w:p>
+    <w:p>
+      <w:pPr>
+        <w:pStyle w:val="P1"/>
+        <w:rPr>
+          <w:lang w:val="uk-UA"/>
+        </w:rPr>
+      </w:pPr>
+      <w:r>
+        <w:rPr>
+          <w:lang w:val="uk-UA"/>
+        </w:rPr>
+      </w:r>
+    </w:p>
+    <w:p>
+      <w:pPr>
+        <w:pStyle w:val="IMG1"/>
+        <w:rPr/>
+      </w:pPr>
+      <w:r>
+        <w:rPr/>
+        <w:drawing>
+          <wp:inline distT="0" distB="0" distL="0" distR="0">
+            <wp:extent cx="6645910" cy="4614545"/>
+            <wp:effectExtent l="0" t="0" r="0" b="0"/>
+            <wp:docPr id="11" name="Зображення12"/>
+            <wp:cNvGraphicFramePr>
+              <a:graphicFrameLocks xmlns:a="http://schemas.openxmlformats.org/drawingml/2006/main" noChangeAspect="1"/>
+            </wp:cNvGraphicFramePr>
+            <a:graphic xmlns:a="http://schemas.openxmlformats.org/drawingml/2006/main">
+              <a:graphicData uri="http://schemas.openxmlformats.org/drawingml/2006/picture">
+                <pic:pic xmlns:pic="http://schemas.openxmlformats.org/drawingml/2006/picture">
+                  <pic:nvPicPr>
+                    <pic:cNvPr id="11" name="Зображення12"/>
+                    <pic:cNvPicPr>
+                      <a:picLocks noChangeAspect="1" noChangeArrowheads="1"/>
+                    </pic:cNvPicPr>
+                  </pic:nvPicPr>
+                  <pic:blipFill>
+                    <a:blip r:embed="rId12"/>
+                    <a:stretch>
+                      <a:fillRect/>
+                    </a:stretch>
+                  </pic:blipFill>
+                  <pic:spPr bwMode="auto">
+                    <a:xfrm>
+                      <a:off x="0" y="0"/>
+                      <a:ext cx="6645910" cy="4614545"/>
+                    </a:xfrm>
+                    <a:prstGeom prst="rect">
+                      <a:avLst/>
+                    </a:prstGeom>
+                    <a:noFill/>
+                  </pic:spPr>
+                </pic:pic>
+              </a:graphicData>
+            </a:graphic>
+          </wp:inline>
+        </w:drawing>
+      </w:r>
+    </w:p>
+    <w:p>
+      <w:pPr>
+        <w:pStyle w:val="IMG1"/>
+        <w:rPr/>
+      </w:pPr>
+      <w:r>
+        <w:rPr/>
+        <w:t>Рисунок 3.3 — Модель після виконання</w:t>
+      </w:r>
+    </w:p>
+    <w:p>
+      <w:pPr>
+        <w:pStyle w:val="P1"/>
+        <w:rPr/>
+      </w:pPr>
+      <w:r>
+        <w:rPr/>
+      </w:r>
+    </w:p>
+    <w:p>
+      <w:pPr>
+        <w:pStyle w:val="H3"/>
+        <w:rPr/>
+      </w:pPr>
+      <w:r>
+        <w:rPr/>
+        <w:t>3.8 Lazy.IBk</w:t>
+      </w:r>
+    </w:p>
+    <w:p>
+      <w:pPr>
+        <w:pStyle w:val="p11"/>
+        <w:rPr>
+          <w:lang w:val="en-US"/>
+        </w:rPr>
+      </w:pPr>
+      <w:r>
+        <w:rPr>
+          <w:lang w:val="en-US"/>
+        </w:rPr>
+      </w:r>
+    </w:p>
+    <w:p>
+      <w:pPr>
+        <w:pStyle w:val="p11"/>
+        <w:rPr>
+          <w:lang w:val="uk-UA"/>
+        </w:rPr>
+      </w:pPr>
+      <w:r>
+        <w:rPr>
+          <w:lang w:val="uk-UA"/>
+        </w:rPr>
+        <w:t>Змінивши такі параметри:</w:t>
+      </w:r>
+    </w:p>
+    <w:p>
+      <w:pPr>
+        <w:pStyle w:val="p11"/>
+        <w:rPr>
+          <w:lang w:val="uk-UA"/>
+        </w:rPr>
+      </w:pPr>
+      <w:r>
+        <w:rPr>
+          <w:lang w:val="uk-UA"/>
+        </w:rPr>
+        <w:t xml:space="preserve">- </w:t>
+      </w:r>
+      <w:r>
+        <w:rPr>
+          <w:lang w:val="en-US"/>
+        </w:rPr>
+        <w:t>KNN – 5;</w:t>
+      </w:r>
+    </w:p>
+    <w:p>
+      <w:pPr>
+        <w:pStyle w:val="p11"/>
+        <w:rPr>
+          <w:lang w:val="en-US"/>
+        </w:rPr>
+      </w:pPr>
+      <w:r>
+        <w:rPr>
+          <w:lang w:val="en-US"/>
+        </w:rPr>
+        <w:t>- windowSize – 5.</w:t>
+      </w:r>
+    </w:p>
+    <w:p>
+      <w:pPr>
+        <w:pStyle w:val="p11"/>
+        <w:rPr>
+          <w:lang w:val="uk-UA"/>
+        </w:rPr>
+      </w:pPr>
+      <w:r>
+        <w:rPr>
+          <w:lang w:val="uk-UA"/>
+        </w:rPr>
+        <w:t>Отримано такі результати:</w:t>
+      </w:r>
+    </w:p>
+    <w:p>
+      <w:pPr>
+        <w:pStyle w:val="IMG1"/>
+        <w:rPr/>
+      </w:pPr>
+      <w:r>
+        <w:rPr/>
+      </w:r>
+    </w:p>
+    <w:p>
+      <w:pPr>
+        <w:pStyle w:val="IMG1"/>
+        <w:rPr/>
+      </w:pPr>
+      <w:r>
+        <w:rPr/>
+        <w:drawing>
+          <wp:inline distT="0" distB="0" distL="0" distR="0">
+            <wp:extent cx="6645910" cy="4614545"/>
+            <wp:effectExtent l="0" t="0" r="0" b="0"/>
+            <wp:docPr id="12" name="Зображення13"/>
+            <wp:cNvGraphicFramePr>
+              <a:graphicFrameLocks xmlns:a="http://schemas.openxmlformats.org/drawingml/2006/main" noChangeAspect="1"/>
+            </wp:cNvGraphicFramePr>
+            <a:graphic xmlns:a="http://schemas.openxmlformats.org/drawingml/2006/main">
+              <a:graphicData uri="http://schemas.openxmlformats.org/drawingml/2006/picture">
+                <pic:pic xmlns:pic="http://schemas.openxmlformats.org/drawingml/2006/picture">
+                  <pic:nvPicPr>
+                    <pic:cNvPr id="12" name="Зображення13"/>
+                    <pic:cNvPicPr>
+                      <a:picLocks noChangeAspect="1" noChangeArrowheads="1"/>
+                    </pic:cNvPicPr>
+                  </pic:nvPicPr>
+                  <pic:blipFill>
+                    <a:blip r:embed="rId13"/>
+                    <a:stretch>
+                      <a:fillRect/>
+                    </a:stretch>
+                  </pic:blipFill>
+                  <pic:spPr bwMode="auto">
+                    <a:xfrm>
+                      <a:off x="0" y="0"/>
+                      <a:ext cx="6645910" cy="4614545"/>
+                    </a:xfrm>
+                    <a:prstGeom prst="rect">
+                      <a:avLst/>
+                    </a:prstGeom>
+                    <a:noFill/>
+                  </pic:spPr>
+                </pic:pic>
+              </a:graphicData>
+            </a:graphic>
+          </wp:inline>
+        </w:drawing>
+      </w:r>
+    </w:p>
+    <w:p>
+      <w:pPr>
+        <w:pStyle w:val="IMG1"/>
+        <w:rPr/>
+      </w:pPr>
+      <w:r>
+        <w:rPr/>
+        <w:t>Рисунок 3.4 — Модель при виконанні</w:t>
+      </w:r>
+    </w:p>
+    <w:p>
+      <w:pPr>
+        <w:pStyle w:val="p11"/>
+        <w:rPr>
+          <w:lang w:val="en-US"/>
+        </w:rPr>
+      </w:pPr>
+      <w:r>
+        <w:rPr>
+          <w:lang w:val="en-US"/>
+        </w:rPr>
+      </w:r>
+    </w:p>
+    <w:p>
+      <w:pPr>
+        <w:pStyle w:val="H2"/>
+        <w:rPr>
+          <w:b/>
+          <w:bCs/>
+        </w:rPr>
+      </w:pPr>
+      <w:r>
+        <w:rPr>
+          <w:b/>
+          <w:bCs/>
+          <w:i w:val="false"/>
+          <w:caps w:val="false"/>
+          <w:smallCaps w:val="false"/>
+          <w:spacing w:val="0"/>
+        </w:rPr>
+        <w:t xml:space="preserve">4 </w:t>
+      </w:r>
+      <w:r>
+        <w:rPr>
+          <w:b/>
+          <w:bCs/>
+          <w:i w:val="false"/>
+          <w:caps w:val="false"/>
+          <w:smallCaps w:val="false"/>
+          <w:spacing w:val="0"/>
+        </w:rPr>
+        <w:t>П</w:t>
+      </w:r>
+      <w:r>
+        <w:rPr>
+          <w:b/>
+          <w:bCs/>
+          <w:i w:val="false"/>
+          <w:caps w:val="false"/>
+          <w:smallCaps w:val="false"/>
+          <w:spacing w:val="0"/>
+        </w:rPr>
+        <w:t xml:space="preserve">орівняти отримані моделі </w:t>
+      </w:r>
+      <w:r>
+        <w:rPr>
+          <w:b/>
+          <w:bCs/>
+          <w:i w:val="false"/>
+          <w:caps w:val="false"/>
+          <w:smallCaps w:val="false"/>
+          <w:spacing w:val="0"/>
+        </w:rPr>
+        <w:t xml:space="preserve">через </w:t>
+      </w:r>
+      <w:r>
+        <w:rPr>
+          <w:b/>
+          <w:bCs/>
+          <w:i w:val="false"/>
+          <w:caps w:val="false"/>
+          <w:smallCaps w:val="false"/>
+          <w:spacing w:val="0"/>
+        </w:rPr>
+        <w:t>модул</w:t>
+      </w:r>
+      <w:r>
+        <w:rPr>
+          <w:b/>
+          <w:bCs/>
+          <w:i w:val="false"/>
+          <w:caps w:val="false"/>
+          <w:smallCaps w:val="false"/>
+          <w:spacing w:val="0"/>
+        </w:rPr>
+        <w:t>ь</w:t>
+      </w:r>
+      <w:r>
+        <w:rPr>
+          <w:b/>
+          <w:bCs/>
+          <w:i w:val="false"/>
+          <w:caps w:val="false"/>
+          <w:smallCaps w:val="false"/>
+          <w:spacing w:val="0"/>
+        </w:rPr>
+        <w:t xml:space="preserve"> Experimenter</w:t>
+      </w:r>
+    </w:p>
+    <w:p>
+      <w:pPr>
+        <w:pStyle w:val="p11"/>
+        <w:rPr>
+          <w:lang w:val="uk-UA"/>
+        </w:rPr>
+      </w:pPr>
+      <w:r>
+        <w:rPr>
+          <w:lang w:val="uk-UA"/>
+        </w:rPr>
+      </w:r>
+    </w:p>
+    <w:p>
+      <w:pPr>
+        <w:pStyle w:val="p11"/>
+        <w:rPr>
+          <w:lang w:val="uk-UA"/>
+        </w:rPr>
+      </w:pPr>
+      <w:r>
+        <w:rPr>
+          <w:lang w:val="uk-UA"/>
+        </w:rPr>
+        <w:t xml:space="preserve">Моделі до вікна </w:t>
+      </w:r>
+      <w:r>
+        <w:rPr>
+          <w:lang w:val="en-US"/>
+        </w:rPr>
+        <w:t xml:space="preserve">Experimenter </w:t>
+      </w:r>
+      <w:r>
+        <w:rPr>
+          <w:lang w:val="uk-UA"/>
+        </w:rPr>
+        <w:t>додано:</w:t>
+      </w:r>
+    </w:p>
+    <w:p>
+      <w:pPr>
+        <w:pStyle w:val="p11"/>
+        <w:rPr>
+          <w:lang w:val="uk-UA"/>
+        </w:rPr>
+      </w:pPr>
+      <w:r>
+        <w:rPr>
+          <w:lang w:val="uk-UA"/>
+        </w:rPr>
+      </w:r>
+    </w:p>
+    <w:p>
+      <w:pPr>
+        <w:pStyle w:val="IMG1"/>
+        <w:rPr/>
+      </w:pPr>
+      <w:r>
+        <w:rPr/>
+        <w:drawing>
+          <wp:inline distT="0" distB="0" distL="0" distR="0">
+            <wp:extent cx="6645910" cy="5006975"/>
+            <wp:effectExtent l="0" t="0" r="0" b="0"/>
+            <wp:docPr id="13" name="Зображення14"/>
+            <wp:cNvGraphicFramePr>
+              <a:graphicFrameLocks xmlns:a="http://schemas.openxmlformats.org/drawingml/2006/main" noChangeAspect="1"/>
+            </wp:cNvGraphicFramePr>
+            <a:graphic xmlns:a="http://schemas.openxmlformats.org/drawingml/2006/main">
+              <a:graphicData uri="http://schemas.openxmlformats.org/drawingml/2006/picture">
+                <pic:pic xmlns:pic="http://schemas.openxmlformats.org/drawingml/2006/picture">
+                  <pic:nvPicPr>
+                    <pic:cNvPr id="13" name="Зображення14"/>
+                    <pic:cNvPicPr>
+                      <a:picLocks noChangeAspect="1" noChangeArrowheads="1"/>
+                    </pic:cNvPicPr>
+                  </pic:nvPicPr>
+                  <pic:blipFill>
+                    <a:blip r:embed="rId14"/>
+                    <a:stretch>
+                      <a:fillRect/>
+                    </a:stretch>
+                  </pic:blipFill>
+                  <pic:spPr bwMode="auto">
+                    <a:xfrm>
+                      <a:off x="0" y="0"/>
+                      <a:ext cx="6645910" cy="5006975"/>
+                    </a:xfrm>
+                    <a:prstGeom prst="rect">
+                      <a:avLst/>
+                    </a:prstGeom>
+                    <a:noFill/>
+                  </pic:spPr>
+                </pic:pic>
+              </a:graphicData>
+            </a:graphic>
+          </wp:inline>
+        </w:drawing>
+      </w:r>
+    </w:p>
+    <w:p>
+      <w:pPr>
+        <w:pStyle w:val="IMG1"/>
+        <w:rPr/>
+      </w:pPr>
+      <w:r>
+        <w:rPr/>
+        <w:t>Рисунок 4.1 — Додані моделі</w:t>
+      </w:r>
+    </w:p>
+    <w:p>
+      <w:pPr>
+        <w:pStyle w:val="p11"/>
+        <w:rPr/>
+      </w:pPr>
+      <w:r>
+        <w:rPr/>
+      </w:r>
+    </w:p>
+    <w:p>
+      <w:pPr>
+        <w:pStyle w:val="p11"/>
+        <w:rPr/>
+      </w:pPr>
+      <w:r>
+        <w:rPr/>
+        <w:t>Після цього було запущено тести:</w:t>
+      </w:r>
+    </w:p>
+    <w:p>
+      <w:pPr>
+        <w:pStyle w:val="img11"/>
+        <w:rPr/>
+      </w:pPr>
+      <w:r>
+        <w:rPr/>
+      </w:r>
+    </w:p>
+    <w:p>
+      <w:pPr>
+        <w:pStyle w:val="img11"/>
+        <w:rPr/>
+      </w:pPr>
+      <w:r>
+        <w:rPr/>
+        <w:drawing>
+          <wp:inline distT="0" distB="0" distL="0" distR="0">
+            <wp:extent cx="6645910" cy="5006975"/>
+            <wp:effectExtent l="0" t="0" r="0" b="0"/>
+            <wp:docPr id="14" name="Зображення15"/>
+            <wp:cNvGraphicFramePr>
+              <a:graphicFrameLocks xmlns:a="http://schemas.openxmlformats.org/drawingml/2006/main" noChangeAspect="1"/>
+            </wp:cNvGraphicFramePr>
+            <a:graphic xmlns:a="http://schemas.openxmlformats.org/drawingml/2006/main">
+              <a:graphicData uri="http://schemas.openxmlformats.org/drawingml/2006/picture">
+                <pic:pic xmlns:pic="http://schemas.openxmlformats.org/drawingml/2006/picture">
+                  <pic:nvPicPr>
+                    <pic:cNvPr id="14" name="Зображення15"/>
+                    <pic:cNvPicPr>
+                      <a:picLocks noChangeAspect="1" noChangeArrowheads="1"/>
+                    </pic:cNvPicPr>
+                  </pic:nvPicPr>
+                  <pic:blipFill>
+                    <a:blip r:embed="rId15"/>
+                    <a:stretch>
+                      <a:fillRect/>
+                    </a:stretch>
+                  </pic:blipFill>
+                  <pic:spPr bwMode="auto">
+                    <a:xfrm>
+                      <a:off x="0" y="0"/>
+                      <a:ext cx="6645910" cy="5006975"/>
+                    </a:xfrm>
+                    <a:prstGeom prst="rect">
+                      <a:avLst/>
+                    </a:prstGeom>
+                    <a:noFill/>
+                  </pic:spPr>
+                </pic:pic>
+              </a:graphicData>
+            </a:graphic>
+          </wp:inline>
+        </w:drawing>
+      </w:r>
+    </w:p>
+    <w:p>
+      <w:pPr>
+        <w:pStyle w:val="img11"/>
+        <w:rPr/>
+      </w:pPr>
+      <w:r>
+        <w:rPr/>
+        <w:t>Рисунок 4.2 — Запущені тести</w:t>
+      </w:r>
+    </w:p>
+    <w:p>
+      <w:pPr>
+        <w:pStyle w:val="p11"/>
+        <w:rPr/>
+      </w:pPr>
+      <w:r>
+        <w:rPr/>
+      </w:r>
+    </w:p>
+    <w:p>
+      <w:pPr>
+        <w:pStyle w:val="h11"/>
+        <w:rPr/>
+      </w:pPr>
+      <w:r>
+        <w:rPr/>
+        <w:t>Висновки</w:t>
+      </w:r>
+    </w:p>
+    <w:p>
+      <w:pPr>
+        <w:pStyle w:val="p11"/>
+        <w:rPr/>
+      </w:pPr>
+      <w:r>
+        <w:rPr/>
+      </w:r>
+    </w:p>
+    <w:p>
+      <w:pPr>
+        <w:pStyle w:val="p11"/>
+        <w:rPr/>
+      </w:pPr>
+      <w:r>
+        <w:rPr/>
+        <w:t>Благодаттю Господа Ісуса Христа було зроблено роботу.</w:t>
+      </w:r>
+    </w:p>
+    <w:p>
+      <w:pPr>
+        <w:pStyle w:val="p11"/>
         <w:rPr/>
       </w:pPr>
       <w:r>
@@ -2985,13 +5112,13 @@
       <w:lang w:val="en-US" w:eastAsia="uk-UA"/>
     </w:rPr>
   </w:style>
-  <w:style w:type="character" w:styleId="user">
-    <w:name w:val="Символ нумерації (user)"/>
+  <w:style w:type="character" w:styleId="Style12">
+    <w:name w:val="Символ нумерації"/>
     <w:qFormat/>
     <w:rPr/>
   </w:style>
-  <w:style w:type="character" w:styleId="Style12">
-    <w:name w:val="Маркери"/>
+  <w:style w:type="character" w:styleId="user">
+    <w:name w:val="Маркери (user)"/>
     <w:qFormat/>
     <w:rPr>
       <w:rFonts w:ascii="OpenSymbol" w:hAnsi="OpenSymbol" w:eastAsia="OpenSymbol" w:cs="OpenSymbol"/>
@@ -3007,7 +5134,7 @@
       <w:spacing w:before="240" w:after="120"/>
     </w:pPr>
     <w:rPr>
-      <w:rFonts w:ascii="Liberation Sans" w:hAnsi="Liberation Sans" w:eastAsia="Microsoft YaHei" w:cs="Arial Unicode MS"/>
+      <w:rFonts w:ascii="Liberation Sans" w:hAnsi="Liberation Sans" w:eastAsia="Microsoft YaHei" w:cs="Lucida Sans"/>
       <w:sz w:val="28"/>
       <w:szCs w:val="28"/>
     </w:rPr>
@@ -3052,7 +5179,7 @@
       <w:suppressLineNumbers/>
     </w:pPr>
     <w:rPr>
-      <w:rFonts w:cs="Arial Unicode MS"/>
+      <w:rFonts w:cs="Lucida Sans"/>
     </w:rPr>
   </w:style>
   <w:style w:type="paragraph" w:styleId="user1">
@@ -3065,7 +5192,7 @@
       <w:spacing w:before="240" w:after="120"/>
     </w:pPr>
     <w:rPr>
-      <w:rFonts w:ascii="Liberation Sans" w:hAnsi="Liberation Sans" w:eastAsia="Microsoft YaHei" w:cs="Lucida Sans"/>
+      <w:rFonts w:ascii="Liberation Sans" w:hAnsi="Liberation Sans" w:eastAsia="Microsoft YaHei" w:cs="Arial Unicode MS"/>
       <w:sz w:val="28"/>
       <w:szCs w:val="28"/>
     </w:rPr>
@@ -3078,12 +5205,12 @@
       <w:suppressLineNumbers/>
     </w:pPr>
     <w:rPr>
-      <w:rFonts w:cs="Lucida Sans"/>
+      <w:rFonts w:cs="Arial Unicode MS"/>
     </w:rPr>
   </w:style>
   <w:style w:type="paragraph" w:styleId="IndexHeading">
     <w:name w:val="index heading"/>
-    <w:basedOn w:val="Style13"/>
+    <w:basedOn w:val="user1"/>
     <w:pPr/>
     <w:rPr/>
   </w:style>
@@ -3362,17 +5489,18 @@
   </w:style>
   <w:style w:type="paragraph" w:styleId="h11">
     <w:name w:val="h11"/>
-    <w:basedOn w:val="Heading2"/>
+    <w:basedOn w:val="Heading1"/>
     <w:next w:val="p11"/>
     <w:qFormat/>
     <w:pPr>
       <w:spacing w:lineRule="auto" w:line="360" w:before="0" w:after="0"/>
-      <w:ind w:firstLine="851"/>
+      <w:ind w:hanging="0"/>
+      <w:jc w:val="center"/>
     </w:pPr>
     <w:rPr>
       <w:rFonts w:ascii="Times New Roman" w:hAnsi="Times New Roman"/>
       <w:b/>
-      <w:smallCaps/>
+      <w:caps/>
       <w:color w:val="auto"/>
       <w:sz w:val="28"/>
     </w:rPr>
@@ -3388,8 +5516,31 @@
     </w:pPr>
     <w:rPr/>
   </w:style>
-  <w:style w:type="numbering" w:styleId="Style15" w:default="1">
-    <w:name w:val="Без маркерів"/>
+  <w:style w:type="paragraph" w:styleId="Style15">
+    <w:name w:val="Вміст таблиці"/>
+    <w:basedOn w:val="Normal"/>
+    <w:qFormat/>
+    <w:pPr>
+      <w:widowControl w:val="false"/>
+      <w:suppressLineNumbers/>
+    </w:pPr>
+    <w:rPr/>
+  </w:style>
+  <w:style w:type="paragraph" w:styleId="Style16">
+    <w:name w:val="Заголовок таблиці"/>
+    <w:basedOn w:val="Style15"/>
+    <w:qFormat/>
+    <w:pPr>
+      <w:suppressLineNumbers/>
+      <w:jc w:val="center"/>
+    </w:pPr>
+    <w:rPr>
+      <w:b/>
+      <w:bCs/>
+    </w:rPr>
+  </w:style>
+  <w:style w:type="numbering" w:styleId="user3" w:default="1">
+    <w:name w:val="Без маркерів (user)"/>
     <w:uiPriority w:val="99"/>
     <w:semiHidden/>
     <w:unhideWhenUsed/>

</xml_diff>

<commit_message>
diploma add a new orders tab
</commit_message>
<xml_diff>
--- a/41IA Intelektualnyj analiz danyh/3/IA_KNT-122_Onyshchenko_19_PR3.docx
+++ b/41IA Intelektualnyj analiz danyh/3/IA_KNT-122_Onyshchenko_19_PR3.docx
@@ -120,7 +120,7 @@
       <w:pPr>
         <w:pStyle w:val="p11"/>
         <w:tabs>
-          <w:tab w:val="clear" w:pos="851"/>
+          <w:tab w:val="clear" w:pos="643"/>
           <w:tab w:val="left" w:pos="2185" w:leader="none"/>
           <w:tab w:val="center" w:pos="4535" w:leader="none"/>
         </w:tabs>
@@ -366,7 +366,7 @@
       <w:pPr>
         <w:pStyle w:val="p11"/>
         <w:tabs>
-          <w:tab w:val="clear" w:pos="851"/>
+          <w:tab w:val="clear" w:pos="643"/>
           <w:tab w:val="left" w:pos="1986" w:leader="none"/>
           <w:tab w:val="left" w:pos="4196" w:leader="none"/>
           <w:tab w:val="center" w:pos="4961" w:leader="none"/>
@@ -386,7 +386,7 @@
       <w:pPr>
         <w:pStyle w:val="p11"/>
         <w:tabs>
-          <w:tab w:val="clear" w:pos="851"/>
+          <w:tab w:val="clear" w:pos="643"/>
           <w:tab w:val="left" w:pos="1986" w:leader="none"/>
           <w:tab w:val="left" w:pos="4196" w:leader="none"/>
           <w:tab w:val="center" w:pos="4961" w:leader="none"/>
@@ -986,19 +986,22 @@
           <w:smallCaps w:val="false"/>
           <w:spacing w:val="0"/>
         </w:rPr>
-        <w:t xml:space="preserve">1 </w:t>
-      </w:r>
-      <w:r>
+        <w:t>1 Завантажити вибірку з лабораторної роботи 2</w:t>
+      </w:r>
+    </w:p>
+    <w:p>
+      <w:pPr>
+        <w:pStyle w:val="P1"/>
         <w:rPr>
           <w:b/>
           <w:bCs/>
           <w:i w:val="false"/>
-          <w:caps w:val="false"/>
-          <w:smallCaps w:val="false"/>
-          <w:spacing w:val="0"/>
-        </w:rPr>
-        <w:t>З</w:t>
-      </w:r>
+          <w:i w:val="false"/>
+          <w:caps w:val="false"/>
+          <w:smallCaps w:val="false"/>
+          <w:spacing w:val="0"/>
+        </w:rPr>
+      </w:pPr>
       <w:r>
         <w:rPr>
           <w:b/>
@@ -1008,31 +1011,6 @@
           <w:smallCaps w:val="false"/>
           <w:spacing w:val="0"/>
         </w:rPr>
-        <w:t>авантажити вибірку з лабораторної роботи 2</w:t>
-      </w:r>
-    </w:p>
-    <w:p>
-      <w:pPr>
-        <w:pStyle w:val="P1"/>
-        <w:rPr>
-          <w:b/>
-          <w:bCs/>
-          <w:i w:val="false"/>
-          <w:i w:val="false"/>
-          <w:caps w:val="false"/>
-          <w:smallCaps w:val="false"/>
-          <w:spacing w:val="0"/>
-        </w:rPr>
-      </w:pPr>
-      <w:r>
-        <w:rPr>
-          <w:b/>
-          <w:bCs/>
-          <w:i w:val="false"/>
-          <w:caps w:val="false"/>
-          <w:smallCaps w:val="false"/>
-          <w:spacing w:val="0"/>
-        </w:rPr>
       </w:r>
     </w:p>
     <w:p>
@@ -1057,7 +1035,30 @@
           <w:smallCaps w:val="false"/>
           <w:spacing w:val="0"/>
         </w:rPr>
-        <w:t>Вибірку завантажено, деталі на рисунку нижче:</w:t>
+        <w:t xml:space="preserve">Вибірку </w:t>
+      </w:r>
+      <w:r>
+        <w:rPr>
+          <w:b w:val="false"/>
+          <w:bCs w:val="false"/>
+          <w:i w:val="false"/>
+          <w:caps w:val="false"/>
+          <w:smallCaps w:val="false"/>
+          <w:spacing w:val="0"/>
+          <w:lang w:val="en-US"/>
+        </w:rPr>
+        <w:t xml:space="preserve">“bank-data.arff” </w:t>
+      </w:r>
+      <w:r>
+        <w:rPr>
+          <w:b w:val="false"/>
+          <w:bCs w:val="false"/>
+          <w:i w:val="false"/>
+          <w:caps w:val="false"/>
+          <w:smallCaps w:val="false"/>
+          <w:spacing w:val="0"/>
+        </w:rPr>
+        <w:t>завантажено, деталі на рисунку нижче:</w:t>
       </w:r>
     </w:p>
     <w:p>
@@ -1179,29 +1180,7 @@
           <w:smallCaps w:val="false"/>
           <w:spacing w:val="0"/>
         </w:rPr>
-        <w:t xml:space="preserve">2 </w:t>
-      </w:r>
-      <w:r>
-        <w:rPr>
-          <w:b/>
-          <w:bCs/>
-          <w:i w:val="false"/>
-          <w:caps w:val="false"/>
-          <w:smallCaps w:val="false"/>
-          <w:spacing w:val="0"/>
-        </w:rPr>
-        <w:t>П</w:t>
-      </w:r>
-      <w:r>
-        <w:rPr>
-          <w:b/>
-          <w:bCs/>
-          <w:i w:val="false"/>
-          <w:caps w:val="false"/>
-          <w:smallCaps w:val="false"/>
-          <w:spacing w:val="0"/>
-        </w:rPr>
-        <w:t>обудувати та оцінити моделі класифікації</w:t>
+        <w:t>2 Побудувати та оцінити моделі класифікації</w:t>
       </w:r>
     </w:p>
     <w:p>
@@ -1241,7 +1220,7 @@
         <w:rPr/>
         <w:drawing>
           <wp:inline distT="0" distB="0" distL="0" distR="0">
-            <wp:extent cx="6645910" cy="6571615"/>
+            <wp:extent cx="5805805" cy="5732780"/>
             <wp:effectExtent l="0" t="0" r="0" b="0"/>
             <wp:docPr id="2" name="Зображення1"/>
             <wp:cNvGraphicFramePr>
@@ -1258,6 +1237,7 @@
                   </pic:nvPicPr>
                   <pic:blipFill>
                     <a:blip r:embed="rId3"/>
+                    <a:srcRect l="0" t="0" r="20874" b="28566"/>
                     <a:stretch>
                       <a:fillRect/>
                     </a:stretch>
@@ -1265,7 +1245,7 @@
                   <pic:spPr bwMode="auto">
                     <a:xfrm>
                       <a:off x="0" y="0"/>
-                      <a:ext cx="6645910" cy="6571615"/>
+                      <a:ext cx="5805805" cy="5732780"/>
                     </a:xfrm>
                     <a:prstGeom prst="rect">
                       <a:avLst/>
@@ -1286,15 +1266,7 @@
       </w:pPr>
       <w:r>
         <w:rPr/>
-        <w:t xml:space="preserve">Рисунок </w:t>
-      </w:r>
-      <w:r>
-        <w:rPr/>
-        <w:t>2</w:t>
-      </w:r>
-      <w:r>
-        <w:rPr/>
-        <w:t xml:space="preserve">.1 — </w:t>
+        <w:t xml:space="preserve">Рисунок 2.1 — </w:t>
       </w:r>
       <w:r>
         <w:rPr>
@@ -1316,26 +1288,10 @@
       </w:pPr>
       <w:r>
         <w:rPr/>
-      </w:r>
-    </w:p>
-    <w:p>
-      <w:pPr>
-        <w:pStyle w:val="IMG1"/>
-        <w:rPr/>
-      </w:pPr>
-      <w:r>
         <w:drawing>
-          <wp:anchor behindDoc="0" distT="0" distB="0" distL="0" distR="0" simplePos="0" locked="0" layoutInCell="0" allowOverlap="1" relativeHeight="4">
-            <wp:simplePos x="0" y="0"/>
-            <wp:positionH relativeFrom="column">
-              <wp:align>center</wp:align>
-            </wp:positionH>
-            <wp:positionV relativeFrom="paragraph">
-              <wp:posOffset>635</wp:posOffset>
-            </wp:positionV>
-            <wp:extent cx="7430135" cy="8174990"/>
+          <wp:inline distT="0" distB="0" distL="0" distR="0">
+            <wp:extent cx="6382385" cy="6935470"/>
             <wp:effectExtent l="0" t="0" r="0" b="0"/>
-            <wp:wrapSquare wrapText="largest"/>
             <wp:docPr id="3" name="Зображення2"/>
             <wp:cNvGraphicFramePr>
               <a:graphicFrameLocks xmlns:a="http://schemas.openxmlformats.org/drawingml/2006/main" noChangeAspect="1"/>
@@ -1351,6 +1307,7 @@
                   </pic:nvPicPr>
                   <pic:blipFill>
                     <a:blip r:embed="rId4"/>
+                    <a:srcRect l="0" t="0" r="21689" b="22199"/>
                     <a:stretch>
                       <a:fillRect/>
                     </a:stretch>
@@ -1358,81 +1315,7 @@
                   <pic:spPr bwMode="auto">
                     <a:xfrm>
                       <a:off x="0" y="0"/>
-                      <a:ext cx="7430135" cy="8174990"/>
-                    </a:xfrm>
-                    <a:prstGeom prst="rect">
-                      <a:avLst/>
-                    </a:prstGeom>
-                    <a:noFill/>
-                  </pic:spPr>
-                </pic:pic>
-              </a:graphicData>
-            </a:graphic>
-          </wp:anchor>
-        </w:drawing>
-      </w:r>
-      <w:r>
-        <w:rPr/>
-        <w:t xml:space="preserve">Рисунок </w:t>
-      </w:r>
-      <w:r>
-        <w:rPr/>
-        <w:t>2</w:t>
-      </w:r>
-      <w:r>
-        <w:rPr/>
-        <w:t xml:space="preserve">.2 — Модель </w:t>
-      </w:r>
-      <w:r>
-        <w:rPr>
-          <w:lang w:val="en-US"/>
-        </w:rPr>
-        <w:t>Rules.OneR</w:t>
-      </w:r>
-    </w:p>
-    <w:p>
-      <w:pPr>
-        <w:pStyle w:val="IMG1"/>
-        <w:rPr/>
-      </w:pPr>
-      <w:r>
-        <w:rPr/>
-      </w:r>
-    </w:p>
-    <w:p>
-      <w:pPr>
-        <w:pStyle w:val="IMG1"/>
-        <w:rPr/>
-      </w:pPr>
-      <w:r>
-        <w:rPr/>
-        <w:drawing>
-          <wp:inline distT="0" distB="0" distL="0" distR="0">
-            <wp:extent cx="6645910" cy="7348220"/>
-            <wp:effectExtent l="0" t="0" r="0" b="0"/>
-            <wp:docPr id="4" name="Зображення9"/>
-            <wp:cNvGraphicFramePr>
-              <a:graphicFrameLocks xmlns:a="http://schemas.openxmlformats.org/drawingml/2006/main" noChangeAspect="1"/>
-            </wp:cNvGraphicFramePr>
-            <a:graphic xmlns:a="http://schemas.openxmlformats.org/drawingml/2006/main">
-              <a:graphicData uri="http://schemas.openxmlformats.org/drawingml/2006/picture">
-                <pic:pic xmlns:pic="http://schemas.openxmlformats.org/drawingml/2006/picture">
-                  <pic:nvPicPr>
-                    <pic:cNvPr id="4" name="Зображення9"/>
-                    <pic:cNvPicPr>
-                      <a:picLocks noChangeAspect="1" noChangeArrowheads="1"/>
-                    </pic:cNvPicPr>
-                  </pic:nvPicPr>
-                  <pic:blipFill>
-                    <a:blip r:embed="rId5"/>
-                    <a:stretch>
-                      <a:fillRect/>
-                    </a:stretch>
-                  </pic:blipFill>
-                  <pic:spPr bwMode="auto">
-                    <a:xfrm>
-                      <a:off x="0" y="0"/>
-                      <a:ext cx="6645910" cy="7348220"/>
+                      <a:ext cx="6382385" cy="6935470"/>
                     </a:xfrm>
                     <a:prstGeom prst="rect">
                       <a:avLst/>
@@ -1453,7 +1336,13 @@
       </w:pPr>
       <w:r>
         <w:rPr/>
-        <w:t>Рисунок 2.3 — Модель Rules.Prism</w:t>
+        <w:t xml:space="preserve">Рисунок 2.2 — Модель </w:t>
+      </w:r>
+      <w:r>
+        <w:rPr>
+          <w:lang w:val="en-US"/>
+        </w:rPr>
+        <w:t>Rules.OneR</w:t>
       </w:r>
     </w:p>
     <w:p>
@@ -1474,7 +1363,74 @@
         <w:rPr/>
         <w:drawing>
           <wp:inline distT="0" distB="0" distL="0" distR="0">
-            <wp:extent cx="6645910" cy="7348220"/>
+            <wp:extent cx="5565775" cy="7380605"/>
+            <wp:effectExtent l="0" t="0" r="0" b="0"/>
+            <wp:docPr id="4" name="Зображення7"/>
+            <wp:cNvGraphicFramePr>
+              <a:graphicFrameLocks xmlns:a="http://schemas.openxmlformats.org/drawingml/2006/main" noChangeAspect="1"/>
+            </wp:cNvGraphicFramePr>
+            <a:graphic xmlns:a="http://schemas.openxmlformats.org/drawingml/2006/main">
+              <a:graphicData uri="http://schemas.openxmlformats.org/drawingml/2006/picture">
+                <pic:pic xmlns:pic="http://schemas.openxmlformats.org/drawingml/2006/picture">
+                  <pic:nvPicPr>
+                    <pic:cNvPr id="4" name="Зображення7"/>
+                    <pic:cNvPicPr>
+                      <a:picLocks noChangeAspect="1" noChangeArrowheads="1"/>
+                    </pic:cNvPicPr>
+                  </pic:nvPicPr>
+                  <pic:blipFill>
+                    <a:blip r:embed="rId5"/>
+                    <a:srcRect l="0" t="0" r="21583" b="4928"/>
+                    <a:stretch>
+                      <a:fillRect/>
+                    </a:stretch>
+                  </pic:blipFill>
+                  <pic:spPr bwMode="auto">
+                    <a:xfrm>
+                      <a:off x="0" y="0"/>
+                      <a:ext cx="5565775" cy="7380605"/>
+                    </a:xfrm>
+                    <a:prstGeom prst="rect">
+                      <a:avLst/>
+                    </a:prstGeom>
+                    <a:noFill/>
+                  </pic:spPr>
+                </pic:pic>
+              </a:graphicData>
+            </a:graphic>
+          </wp:inline>
+        </w:drawing>
+      </w:r>
+    </w:p>
+    <w:p>
+      <w:pPr>
+        <w:pStyle w:val="IMG1"/>
+        <w:rPr/>
+      </w:pPr>
+      <w:r>
+        <w:rPr/>
+        <w:t>Рисунок 2.3 — Модель Rules.Prism</w:t>
+      </w:r>
+    </w:p>
+    <w:p>
+      <w:pPr>
+        <w:pStyle w:val="IMG1"/>
+        <w:rPr/>
+      </w:pPr>
+      <w:r>
+        <w:rPr/>
+      </w:r>
+    </w:p>
+    <w:p>
+      <w:pPr>
+        <w:pStyle w:val="IMG1"/>
+        <w:rPr/>
+      </w:pPr>
+      <w:r>
+        <w:rPr/>
+        <w:drawing>
+          <wp:inline distT="0" distB="0" distL="0" distR="0">
+            <wp:extent cx="5287010" cy="7103745"/>
             <wp:effectExtent l="0" t="0" r="0" b="0"/>
             <wp:docPr id="5" name="Зображення3"/>
             <wp:cNvGraphicFramePr>
@@ -1491,6 +1447,7 @@
                   </pic:nvPicPr>
                   <pic:blipFill>
                     <a:blip r:embed="rId6"/>
+                    <a:srcRect l="0" t="0" r="22000" b="4183"/>
                     <a:stretch>
                       <a:fillRect/>
                     </a:stretch>
@@ -1498,7 +1455,7 @@
                   <pic:spPr bwMode="auto">
                     <a:xfrm>
                       <a:off x="0" y="0"/>
-                      <a:ext cx="6645910" cy="7348220"/>
+                      <a:ext cx="5287010" cy="7103745"/>
                     </a:xfrm>
                     <a:prstGeom prst="rect">
                       <a:avLst/>
@@ -1566,7 +1523,7 @@
         <w:rPr/>
         <w:drawing>
           <wp:inline distT="0" distB="0" distL="0" distR="0">
-            <wp:extent cx="6645910" cy="7623810"/>
+            <wp:extent cx="5414010" cy="7157720"/>
             <wp:effectExtent l="0" t="0" r="0" b="0"/>
             <wp:docPr id="6" name="Зображення4"/>
             <wp:cNvGraphicFramePr>
@@ -1583,6 +1540,7 @@
                   </pic:nvPicPr>
                   <pic:blipFill>
                     <a:blip r:embed="rId7"/>
+                    <a:srcRect l="0" t="0" r="21016" b="4528"/>
                     <a:stretch>
                       <a:fillRect/>
                     </a:stretch>
@@ -1590,7 +1548,7 @@
                   <pic:spPr bwMode="auto">
                     <a:xfrm>
                       <a:off x="0" y="0"/>
-                      <a:ext cx="6645910" cy="7623810"/>
+                      <a:ext cx="5414010" cy="7157720"/>
                     </a:xfrm>
                     <a:prstGeom prst="rect">
                       <a:avLst/>
@@ -1658,7 +1616,7 @@
         <w:rPr/>
         <w:drawing>
           <wp:inline distT="0" distB="0" distL="0" distR="0">
-            <wp:extent cx="6356350" cy="7976870"/>
+            <wp:extent cx="5636260" cy="7345045"/>
             <wp:effectExtent l="0" t="0" r="0" b="0"/>
             <wp:docPr id="7" name="Зображення5"/>
             <wp:cNvGraphicFramePr>
@@ -1675,6 +1633,7 @@
                   </pic:nvPicPr>
                   <pic:blipFill>
                     <a:blip r:embed="rId8"/>
+                    <a:srcRect l="0" t="0" r="20638" b="5443"/>
                     <a:stretch>
                       <a:fillRect/>
                     </a:stretch>
@@ -1682,7 +1641,7 @@
                   <pic:spPr bwMode="auto">
                     <a:xfrm>
                       <a:off x="0" y="0"/>
-                      <a:ext cx="6356350" cy="7976870"/>
+                      <a:ext cx="5636260" cy="7345045"/>
                     </a:xfrm>
                     <a:prstGeom prst="rect">
                       <a:avLst/>
@@ -1750,7 +1709,7 @@
         <w:rPr/>
         <w:drawing>
           <wp:inline distT="0" distB="0" distL="0" distR="0">
-            <wp:extent cx="6645910" cy="5532755"/>
+            <wp:extent cx="6054090" cy="6057265"/>
             <wp:effectExtent l="0" t="0" r="0" b="0"/>
             <wp:docPr id="8" name="Зображення6"/>
             <wp:cNvGraphicFramePr>
@@ -1767,6 +1726,7 @@
                   </pic:nvPicPr>
                   <pic:blipFill>
                     <a:blip r:embed="rId9"/>
+                    <a:srcRect l="0" t="0" r="20638" b="27396"/>
                     <a:stretch>
                       <a:fillRect/>
                     </a:stretch>
@@ -1774,7 +1734,7 @@
                   <pic:spPr bwMode="auto">
                     <a:xfrm>
                       <a:off x="0" y="0"/>
-                      <a:ext cx="6645910" cy="5532755"/>
+                      <a:ext cx="6054090" cy="6057265"/>
                     </a:xfrm>
                     <a:prstGeom prst="rect">
                       <a:avLst/>
@@ -1854,18 +1814,17 @@
           <w:smallCaps w:val="false"/>
           <w:spacing w:val="0"/>
         </w:rPr>
-        <w:t xml:space="preserve">3 </w:t>
+        <w:t>3 Досягти найліпшої якості навчання різних</w:t>
       </w:r>
       <w:r>
         <w:rPr>
           <w:b/>
           <w:bCs/>
-          <w:i w:val="false"/>
-          <w:caps w:val="false"/>
-          <w:smallCaps w:val="false"/>
-          <w:spacing w:val="0"/>
-        </w:rPr>
-        <w:t>Д</w:t>
+          <w:caps w:val="false"/>
+          <w:smallCaps w:val="false"/>
+          <w:spacing w:val="0"/>
+        </w:rPr>
+        <w:t xml:space="preserve"> </w:t>
       </w:r>
       <w:r>
         <w:rPr>
@@ -1876,27 +1835,6 @@
           <w:smallCaps w:val="false"/>
           <w:spacing w:val="0"/>
         </w:rPr>
-        <w:t>осягти найліпшої якості навчання різних</w:t>
-      </w:r>
-      <w:r>
-        <w:rPr>
-          <w:b/>
-          <w:bCs/>
-          <w:caps w:val="false"/>
-          <w:smallCaps w:val="false"/>
-          <w:spacing w:val="0"/>
-        </w:rPr>
-        <w:t xml:space="preserve"> </w:t>
-      </w:r>
-      <w:r>
-        <w:rPr>
-          <w:b/>
-          <w:bCs/>
-          <w:i w:val="false"/>
-          <w:caps w:val="false"/>
-          <w:smallCaps w:val="false"/>
-          <w:spacing w:val="0"/>
-        </w:rPr>
         <w:t>класифікаторів</w:t>
       </w:r>
     </w:p>
@@ -1946,6 +1884,7 @@
     <w:p>
       <w:pPr>
         <w:pStyle w:val="p11"/>
+        <w:spacing w:before="0" w:after="0"/>
         <w:rPr>
           <w:lang w:val="uk-UA"/>
         </w:rPr>
@@ -1959,7 +1898,7 @@
     </w:p>
     <w:tbl>
       <w:tblPr>
-        <w:tblW w:w="7021" w:type="dxa"/>
+        <w:tblW w:w="9026" w:type="dxa"/>
         <w:jc w:val="left"/>
         <w:tblInd w:w="55" w:type="dxa"/>
         <w:tblLayout w:type="fixed"/>
@@ -1973,7 +1912,8 @@
       <w:tblGrid>
         <w:gridCol w:w="412"/>
         <w:gridCol w:w="2238"/>
-        <w:gridCol w:w="4371"/>
+        <w:gridCol w:w="4120"/>
+        <w:gridCol w:w="2256"/>
       </w:tblGrid>
       <w:tr>
         <w:trPr/>
@@ -1985,10 +1925,11 @@
               <w:left w:val="single" w:sz="4" w:space="0" w:color="000000"/>
               <w:bottom w:val="single" w:sz="4" w:space="0" w:color="000000"/>
             </w:tcBorders>
+            <w:vAlign w:val="center"/>
           </w:tcPr>
           <w:p>
             <w:pPr>
-              <w:pStyle w:val="Style15"/>
+              <w:pStyle w:val="user3"/>
               <w:spacing w:lineRule="auto" w:line="240"/>
               <w:ind w:hanging="0" w:left="0"/>
               <w:rPr>
@@ -2015,10 +1956,11 @@
               <w:left w:val="single" w:sz="4" w:space="0" w:color="000000"/>
               <w:bottom w:val="single" w:sz="4" w:space="0" w:color="000000"/>
             </w:tcBorders>
+            <w:vAlign w:val="center"/>
           </w:tcPr>
           <w:p>
             <w:pPr>
-              <w:pStyle w:val="Style15"/>
+              <w:pStyle w:val="user3"/>
               <w:spacing w:lineRule="auto" w:line="240"/>
               <w:ind w:hanging="0" w:left="0"/>
               <w:rPr>
@@ -2037,17 +1979,47 @@
         </w:tc>
         <w:tc>
           <w:tcPr>
-            <w:tcW w:w="4371" w:type="dxa"/>
+            <w:tcW w:w="4120" w:type="dxa"/>
+            <w:tcBorders>
+              <w:top w:val="single" w:sz="4" w:space="0" w:color="000000"/>
+              <w:left w:val="single" w:sz="4" w:space="0" w:color="000000"/>
+              <w:bottom w:val="single" w:sz="4" w:space="0" w:color="000000"/>
+            </w:tcBorders>
+            <w:vAlign w:val="center"/>
+          </w:tcPr>
+          <w:p>
+            <w:pPr>
+              <w:pStyle w:val="user3"/>
+              <w:spacing w:lineRule="auto" w:line="240"/>
+              <w:ind w:hanging="0" w:left="0"/>
+              <w:rPr>
+                <w:b/>
+                <w:bCs/>
+              </w:rPr>
+            </w:pPr>
+            <w:r>
+              <w:rPr>
+                <w:b/>
+                <w:bCs/>
+              </w:rPr>
+              <w:t>Кількість правильних відповідей</w:t>
+            </w:r>
+          </w:p>
+        </w:tc>
+        <w:tc>
+          <w:tcPr>
+            <w:tcW w:w="2256" w:type="dxa"/>
             <w:tcBorders>
               <w:top w:val="single" w:sz="4" w:space="0" w:color="000000"/>
               <w:left w:val="single" w:sz="4" w:space="0" w:color="000000"/>
               <w:bottom w:val="single" w:sz="4" w:space="0" w:color="000000"/>
               <w:right w:val="single" w:sz="4" w:space="0" w:color="000000"/>
             </w:tcBorders>
+            <w:vAlign w:val="center"/>
           </w:tcPr>
           <w:p>
             <w:pPr>
-              <w:pStyle w:val="Style15"/>
+              <w:pStyle w:val="user3"/>
               <w:spacing w:lineRule="auto" w:line="240"/>
               <w:ind w:hanging="0" w:left="0"/>
               <w:rPr>
@@ -2060,7 +2032,7 @@
                 <w:b/>
                 <w:bCs/>
               </w:rPr>
-              <w:t>Кількість правильних відповідей</w:t>
+              <w:t>Відсоток правильних</w:t>
             </w:r>
           </w:p>
         </w:tc>
@@ -2074,10 +2046,11 @@
               <w:left w:val="single" w:sz="4" w:space="0" w:color="000000"/>
               <w:bottom w:val="single" w:sz="4" w:space="0" w:color="000000"/>
             </w:tcBorders>
+            <w:vAlign w:val="center"/>
           </w:tcPr>
           <w:p>
             <w:pPr>
-              <w:pStyle w:val="Style15"/>
+              <w:pStyle w:val="user3"/>
               <w:spacing w:lineRule="auto" w:line="240"/>
               <w:ind w:hanging="0" w:left="0"/>
               <w:rPr>
@@ -2103,10 +2076,11 @@
               <w:left w:val="single" w:sz="4" w:space="0" w:color="000000"/>
               <w:bottom w:val="single" w:sz="4" w:space="0" w:color="000000"/>
             </w:tcBorders>
+            <w:vAlign w:val="center"/>
           </w:tcPr>
           <w:p>
             <w:pPr>
-              <w:pStyle w:val="Style15"/>
+              <w:pStyle w:val="user3"/>
               <w:spacing w:lineRule="auto" w:line="240"/>
               <w:ind w:hanging="0" w:left="0"/>
               <w:rPr>
@@ -2127,31 +2101,62 @@
         </w:tc>
         <w:tc>
           <w:tcPr>
-            <w:tcW w:w="4371" w:type="dxa"/>
+            <w:tcW w:w="4120" w:type="dxa"/>
+            <w:tcBorders>
+              <w:left w:val="single" w:sz="4" w:space="0" w:color="000000"/>
+              <w:bottom w:val="single" w:sz="4" w:space="0" w:color="000000"/>
+            </w:tcBorders>
+            <w:vAlign w:val="center"/>
+          </w:tcPr>
+          <w:p>
+            <w:pPr>
+              <w:pStyle w:val="user3"/>
+              <w:spacing w:lineRule="auto" w:line="240"/>
+              <w:ind w:hanging="0" w:left="0"/>
+              <w:rPr>
+                <w:b w:val="false"/>
+                <w:bCs w:val="false"/>
+                <w:lang w:val="en-US"/>
+              </w:rPr>
+            </w:pPr>
+            <w:r>
+              <w:rPr>
+                <w:b w:val="false"/>
+                <w:bCs w:val="false"/>
+                <w:lang w:val="en-US"/>
+              </w:rPr>
+              <w:t>326</w:t>
+            </w:r>
+          </w:p>
+        </w:tc>
+        <w:tc>
+          <w:tcPr>
+            <w:tcW w:w="2256" w:type="dxa"/>
             <w:tcBorders>
               <w:left w:val="single" w:sz="4" w:space="0" w:color="000000"/>
               <w:bottom w:val="single" w:sz="4" w:space="0" w:color="000000"/>
               <w:right w:val="single" w:sz="4" w:space="0" w:color="000000"/>
             </w:tcBorders>
+            <w:vAlign w:val="center"/>
           </w:tcPr>
           <w:p>
             <w:pPr>
-              <w:pStyle w:val="Style15"/>
+              <w:pStyle w:val="user3"/>
               <w:spacing w:lineRule="auto" w:line="240"/>
               <w:ind w:hanging="0" w:left="0"/>
               <w:rPr>
                 <w:b w:val="false"/>
                 <w:bCs w:val="false"/>
-                <w:lang w:val="en-US"/>
+                <w:lang w:val="uk-UA"/>
               </w:rPr>
             </w:pPr>
             <w:r>
               <w:rPr>
                 <w:b w:val="false"/>
                 <w:bCs w:val="false"/>
-                <w:lang w:val="en-US"/>
-              </w:rPr>
-              <w:t>600</w:t>
+                <w:lang w:val="uk-UA"/>
+              </w:rPr>
+              <w:t>54</w:t>
             </w:r>
           </w:p>
         </w:tc>
@@ -2165,10 +2170,11 @@
               <w:left w:val="single" w:sz="4" w:space="0" w:color="000000"/>
               <w:bottom w:val="single" w:sz="4" w:space="0" w:color="000000"/>
             </w:tcBorders>
+            <w:vAlign w:val="center"/>
           </w:tcPr>
           <w:p>
             <w:pPr>
-              <w:pStyle w:val="Style15"/>
+              <w:pStyle w:val="user3"/>
               <w:spacing w:lineRule="auto" w:line="240"/>
               <w:ind w:hanging="0" w:left="0"/>
               <w:rPr>
@@ -2194,10 +2200,11 @@
               <w:left w:val="single" w:sz="4" w:space="0" w:color="000000"/>
               <w:bottom w:val="single" w:sz="4" w:space="0" w:color="000000"/>
             </w:tcBorders>
+            <w:vAlign w:val="center"/>
           </w:tcPr>
           <w:p>
             <w:pPr>
-              <w:pStyle w:val="Style15"/>
+              <w:pStyle w:val="user3"/>
               <w:spacing w:lineRule="auto" w:line="240"/>
               <w:ind w:hanging="0" w:left="0"/>
               <w:rPr>
@@ -2218,31 +2225,62 @@
         </w:tc>
         <w:tc>
           <w:tcPr>
-            <w:tcW w:w="4371" w:type="dxa"/>
+            <w:tcW w:w="4120" w:type="dxa"/>
+            <w:tcBorders>
+              <w:left w:val="single" w:sz="4" w:space="0" w:color="000000"/>
+              <w:bottom w:val="single" w:sz="4" w:space="0" w:color="000000"/>
+            </w:tcBorders>
+            <w:vAlign w:val="center"/>
+          </w:tcPr>
+          <w:p>
+            <w:pPr>
+              <w:pStyle w:val="user3"/>
+              <w:spacing w:lineRule="auto" w:line="240"/>
+              <w:ind w:hanging="0" w:left="0"/>
+              <w:rPr>
+                <w:b w:val="false"/>
+                <w:bCs w:val="false"/>
+                <w:lang w:val="en-US"/>
+              </w:rPr>
+            </w:pPr>
+            <w:r>
+              <w:rPr>
+                <w:b w:val="false"/>
+                <w:bCs w:val="false"/>
+                <w:lang w:val="en-US"/>
+              </w:rPr>
+              <w:t>411</w:t>
+            </w:r>
+          </w:p>
+        </w:tc>
+        <w:tc>
+          <w:tcPr>
+            <w:tcW w:w="2256" w:type="dxa"/>
             <w:tcBorders>
               <w:left w:val="single" w:sz="4" w:space="0" w:color="000000"/>
               <w:bottom w:val="single" w:sz="4" w:space="0" w:color="000000"/>
               <w:right w:val="single" w:sz="4" w:space="0" w:color="000000"/>
             </w:tcBorders>
+            <w:vAlign w:val="center"/>
           </w:tcPr>
           <w:p>
             <w:pPr>
-              <w:pStyle w:val="Style15"/>
+              <w:pStyle w:val="user3"/>
               <w:spacing w:lineRule="auto" w:line="240"/>
               <w:ind w:hanging="0" w:left="0"/>
               <w:rPr>
                 <w:b w:val="false"/>
                 <w:bCs w:val="false"/>
-                <w:lang w:val="en-US"/>
+                <w:lang w:val="uk-UA"/>
               </w:rPr>
             </w:pPr>
             <w:r>
               <w:rPr>
                 <w:b w:val="false"/>
                 <w:bCs w:val="false"/>
-                <w:lang w:val="en-US"/>
-              </w:rPr>
-              <w:t>600</w:t>
+                <w:lang w:val="uk-UA"/>
+              </w:rPr>
+              <w:t>68</w:t>
             </w:r>
           </w:p>
         </w:tc>
@@ -2256,10 +2294,11 @@
               <w:left w:val="single" w:sz="4" w:space="0" w:color="000000"/>
               <w:bottom w:val="single" w:sz="4" w:space="0" w:color="000000"/>
             </w:tcBorders>
+            <w:vAlign w:val="center"/>
           </w:tcPr>
           <w:p>
             <w:pPr>
-              <w:pStyle w:val="Style15"/>
+              <w:pStyle w:val="user3"/>
               <w:spacing w:lineRule="auto" w:line="240"/>
               <w:ind w:hanging="0" w:left="0"/>
               <w:rPr>
@@ -2285,10 +2324,11 @@
               <w:left w:val="single" w:sz="4" w:space="0" w:color="000000"/>
               <w:bottom w:val="single" w:sz="4" w:space="0" w:color="000000"/>
             </w:tcBorders>
+            <w:vAlign w:val="center"/>
           </w:tcPr>
           <w:p>
             <w:pPr>
-              <w:pStyle w:val="Style15"/>
+              <w:pStyle w:val="user3"/>
               <w:spacing w:lineRule="auto" w:line="240"/>
               <w:ind w:hanging="0" w:left="0"/>
               <w:rPr>
@@ -2309,16 +2349,47 @@
         </w:tc>
         <w:tc>
           <w:tcPr>
-            <w:tcW w:w="4371" w:type="dxa"/>
+            <w:tcW w:w="4120" w:type="dxa"/>
+            <w:tcBorders>
+              <w:left w:val="single" w:sz="4" w:space="0" w:color="000000"/>
+              <w:bottom w:val="single" w:sz="4" w:space="0" w:color="000000"/>
+            </w:tcBorders>
+            <w:vAlign w:val="center"/>
+          </w:tcPr>
+          <w:p>
+            <w:pPr>
+              <w:pStyle w:val="user3"/>
+              <w:spacing w:lineRule="auto" w:line="240"/>
+              <w:ind w:hanging="0" w:left="0"/>
+              <w:rPr>
+                <w:b w:val="false"/>
+                <w:bCs w:val="false"/>
+                <w:lang w:val="uk-UA"/>
+              </w:rPr>
+            </w:pPr>
+            <w:r>
+              <w:rPr>
+                <w:b w:val="false"/>
+                <w:bCs w:val="false"/>
+                <w:lang w:val="uk-UA"/>
+              </w:rPr>
+              <w:t>438</w:t>
+            </w:r>
+          </w:p>
+        </w:tc>
+        <w:tc>
+          <w:tcPr>
+            <w:tcW w:w="2256" w:type="dxa"/>
             <w:tcBorders>
               <w:left w:val="single" w:sz="4" w:space="0" w:color="000000"/>
               <w:bottom w:val="single" w:sz="4" w:space="0" w:color="000000"/>
               <w:right w:val="single" w:sz="4" w:space="0" w:color="000000"/>
             </w:tcBorders>
+            <w:vAlign w:val="center"/>
           </w:tcPr>
           <w:p>
             <w:pPr>
-              <w:pStyle w:val="Style15"/>
+              <w:pStyle w:val="user3"/>
               <w:spacing w:lineRule="auto" w:line="240"/>
               <w:ind w:hanging="0" w:left="0"/>
               <w:rPr>
@@ -2333,7 +2404,7 @@
                 <w:bCs w:val="false"/>
                 <w:lang w:val="uk-UA"/>
               </w:rPr>
-              <w:t>600</w:t>
+              <w:t>73</w:t>
             </w:r>
           </w:p>
         </w:tc>
@@ -2347,10 +2418,11 @@
               <w:left w:val="single" w:sz="4" w:space="0" w:color="000000"/>
               <w:bottom w:val="single" w:sz="4" w:space="0" w:color="000000"/>
             </w:tcBorders>
+            <w:vAlign w:val="center"/>
           </w:tcPr>
           <w:p>
             <w:pPr>
-              <w:pStyle w:val="Style15"/>
+              <w:pStyle w:val="user3"/>
               <w:spacing w:lineRule="auto" w:line="240"/>
               <w:ind w:hanging="0" w:left="0"/>
               <w:rPr>
@@ -2376,10 +2448,11 @@
               <w:left w:val="single" w:sz="4" w:space="0" w:color="000000"/>
               <w:bottom w:val="single" w:sz="4" w:space="0" w:color="000000"/>
             </w:tcBorders>
+            <w:vAlign w:val="center"/>
           </w:tcPr>
           <w:p>
             <w:pPr>
-              <w:pStyle w:val="Style15"/>
+              <w:pStyle w:val="user3"/>
               <w:spacing w:lineRule="auto" w:line="240"/>
               <w:ind w:hanging="0" w:left="0"/>
               <w:rPr>
@@ -2400,31 +2473,62 @@
         </w:tc>
         <w:tc>
           <w:tcPr>
-            <w:tcW w:w="4371" w:type="dxa"/>
+            <w:tcW w:w="4120" w:type="dxa"/>
+            <w:tcBorders>
+              <w:left w:val="single" w:sz="4" w:space="0" w:color="000000"/>
+              <w:bottom w:val="single" w:sz="4" w:space="0" w:color="000000"/>
+            </w:tcBorders>
+            <w:vAlign w:val="center"/>
+          </w:tcPr>
+          <w:p>
+            <w:pPr>
+              <w:pStyle w:val="user3"/>
+              <w:spacing w:lineRule="auto" w:line="240"/>
+              <w:ind w:hanging="0" w:left="0"/>
+              <w:rPr>
+                <w:b w:val="false"/>
+                <w:bCs w:val="false"/>
+                <w:lang w:val="en-US"/>
+              </w:rPr>
+            </w:pPr>
+            <w:r>
+              <w:rPr>
+                <w:b w:val="false"/>
+                <w:bCs w:val="false"/>
+                <w:lang w:val="en-US"/>
+              </w:rPr>
+              <w:t>422</w:t>
+            </w:r>
+          </w:p>
+        </w:tc>
+        <w:tc>
+          <w:tcPr>
+            <w:tcW w:w="2256" w:type="dxa"/>
             <w:tcBorders>
               <w:left w:val="single" w:sz="4" w:space="0" w:color="000000"/>
               <w:bottom w:val="single" w:sz="4" w:space="0" w:color="000000"/>
               <w:right w:val="single" w:sz="4" w:space="0" w:color="000000"/>
             </w:tcBorders>
+            <w:vAlign w:val="center"/>
           </w:tcPr>
           <w:p>
             <w:pPr>
-              <w:pStyle w:val="Style15"/>
+              <w:pStyle w:val="user3"/>
               <w:spacing w:lineRule="auto" w:line="240"/>
               <w:ind w:hanging="0" w:left="0"/>
               <w:rPr>
                 <w:b w:val="false"/>
                 <w:bCs w:val="false"/>
-                <w:lang w:val="en-US"/>
+                <w:lang w:val="uk-UA"/>
               </w:rPr>
             </w:pPr>
             <w:r>
               <w:rPr>
                 <w:b w:val="false"/>
                 <w:bCs w:val="false"/>
-                <w:lang w:val="en-US"/>
-              </w:rPr>
-              <w:t>600</w:t>
+                <w:lang w:val="uk-UA"/>
+              </w:rPr>
+              <w:t>70</w:t>
             </w:r>
           </w:p>
         </w:tc>
@@ -2438,10 +2542,11 @@
               <w:left w:val="single" w:sz="4" w:space="0" w:color="000000"/>
               <w:bottom w:val="single" w:sz="4" w:space="0" w:color="000000"/>
             </w:tcBorders>
+            <w:vAlign w:val="center"/>
           </w:tcPr>
           <w:p>
             <w:pPr>
-              <w:pStyle w:val="Style15"/>
+              <w:pStyle w:val="user3"/>
               <w:spacing w:lineRule="auto" w:line="240"/>
               <w:ind w:hanging="0" w:left="0"/>
               <w:rPr>
@@ -2467,10 +2572,11 @@
               <w:left w:val="single" w:sz="4" w:space="0" w:color="000000"/>
               <w:bottom w:val="single" w:sz="4" w:space="0" w:color="000000"/>
             </w:tcBorders>
+            <w:vAlign w:val="center"/>
           </w:tcPr>
           <w:p>
             <w:pPr>
-              <w:pStyle w:val="Style15"/>
+              <w:pStyle w:val="user3"/>
               <w:spacing w:lineRule="auto" w:line="240"/>
               <w:ind w:hanging="0" w:left="0"/>
               <w:rPr>
@@ -2491,16 +2597,47 @@
         </w:tc>
         <w:tc>
           <w:tcPr>
-            <w:tcW w:w="4371" w:type="dxa"/>
+            <w:tcW w:w="4120" w:type="dxa"/>
+            <w:tcBorders>
+              <w:left w:val="single" w:sz="4" w:space="0" w:color="000000"/>
+              <w:bottom w:val="single" w:sz="4" w:space="0" w:color="000000"/>
+            </w:tcBorders>
+            <w:vAlign w:val="center"/>
+          </w:tcPr>
+          <w:p>
+            <w:pPr>
+              <w:pStyle w:val="user3"/>
+              <w:spacing w:lineRule="auto" w:line="240"/>
+              <w:ind w:hanging="0" w:left="0"/>
+              <w:rPr>
+                <w:b w:val="false"/>
+                <w:bCs w:val="false"/>
+                <w:lang w:val="uk-UA"/>
+              </w:rPr>
+            </w:pPr>
+            <w:r>
+              <w:rPr>
+                <w:b w:val="false"/>
+                <w:bCs w:val="false"/>
+                <w:lang w:val="uk-UA"/>
+              </w:rPr>
+              <w:t>510</w:t>
+            </w:r>
+          </w:p>
+        </w:tc>
+        <w:tc>
+          <w:tcPr>
+            <w:tcW w:w="2256" w:type="dxa"/>
             <w:tcBorders>
               <w:left w:val="single" w:sz="4" w:space="0" w:color="000000"/>
               <w:bottom w:val="single" w:sz="4" w:space="0" w:color="000000"/>
               <w:right w:val="single" w:sz="4" w:space="0" w:color="000000"/>
             </w:tcBorders>
+            <w:vAlign w:val="center"/>
           </w:tcPr>
           <w:p>
             <w:pPr>
-              <w:pStyle w:val="Style15"/>
+              <w:pStyle w:val="user3"/>
               <w:spacing w:lineRule="auto" w:line="240"/>
               <w:ind w:hanging="0" w:left="0"/>
               <w:rPr>
@@ -2515,7 +2652,7 @@
                 <w:bCs w:val="false"/>
                 <w:lang w:val="uk-UA"/>
               </w:rPr>
-              <w:t>600</w:t>
+              <w:t>85</w:t>
             </w:r>
           </w:p>
         </w:tc>
@@ -2529,10 +2666,11 @@
               <w:left w:val="single" w:sz="4" w:space="0" w:color="000000"/>
               <w:bottom w:val="single" w:sz="4" w:space="0" w:color="000000"/>
             </w:tcBorders>
+            <w:vAlign w:val="center"/>
           </w:tcPr>
           <w:p>
             <w:pPr>
-              <w:pStyle w:val="Style15"/>
+              <w:pStyle w:val="user3"/>
               <w:spacing w:lineRule="auto" w:line="240"/>
               <w:ind w:hanging="0" w:left="0"/>
               <w:rPr>
@@ -2558,10 +2696,11 @@
               <w:left w:val="single" w:sz="4" w:space="0" w:color="000000"/>
               <w:bottom w:val="single" w:sz="4" w:space="0" w:color="000000"/>
             </w:tcBorders>
+            <w:vAlign w:val="center"/>
           </w:tcPr>
           <w:p>
             <w:pPr>
-              <w:pStyle w:val="Style15"/>
+              <w:pStyle w:val="user3"/>
               <w:spacing w:lineRule="auto" w:line="240"/>
               <w:ind w:hanging="0" w:left="0"/>
               <w:rPr>
@@ -2582,16 +2721,47 @@
         </w:tc>
         <w:tc>
           <w:tcPr>
-            <w:tcW w:w="4371" w:type="dxa"/>
+            <w:tcW w:w="4120" w:type="dxa"/>
+            <w:tcBorders>
+              <w:left w:val="single" w:sz="4" w:space="0" w:color="000000"/>
+              <w:bottom w:val="single" w:sz="4" w:space="0" w:color="000000"/>
+            </w:tcBorders>
+            <w:vAlign w:val="center"/>
+          </w:tcPr>
+          <w:p>
+            <w:pPr>
+              <w:pStyle w:val="user3"/>
+              <w:spacing w:lineRule="auto" w:line="240"/>
+              <w:ind w:hanging="0" w:left="0"/>
+              <w:rPr>
+                <w:b w:val="false"/>
+                <w:bCs w:val="false"/>
+                <w:lang w:val="uk-UA"/>
+              </w:rPr>
+            </w:pPr>
+            <w:r>
+              <w:rPr>
+                <w:b w:val="false"/>
+                <w:bCs w:val="false"/>
+                <w:lang w:val="uk-UA"/>
+              </w:rPr>
+              <w:t>414</w:t>
+            </w:r>
+          </w:p>
+        </w:tc>
+        <w:tc>
+          <w:tcPr>
+            <w:tcW w:w="2256" w:type="dxa"/>
             <w:tcBorders>
               <w:left w:val="single" w:sz="4" w:space="0" w:color="000000"/>
               <w:bottom w:val="single" w:sz="4" w:space="0" w:color="000000"/>
               <w:right w:val="single" w:sz="4" w:space="0" w:color="000000"/>
             </w:tcBorders>
+            <w:vAlign w:val="center"/>
           </w:tcPr>
           <w:p>
             <w:pPr>
-              <w:pStyle w:val="Style15"/>
+              <w:pStyle w:val="user3"/>
               <w:spacing w:lineRule="auto" w:line="240"/>
               <w:ind w:hanging="0" w:left="0"/>
               <w:rPr>
@@ -2606,7 +2776,7 @@
                 <w:bCs w:val="false"/>
                 <w:lang w:val="uk-UA"/>
               </w:rPr>
-              <w:t>600</w:t>
+              <w:t>69</w:t>
             </w:r>
           </w:p>
         </w:tc>
@@ -2620,10 +2790,11 @@
               <w:left w:val="single" w:sz="4" w:space="0" w:color="000000"/>
               <w:bottom w:val="single" w:sz="4" w:space="0" w:color="000000"/>
             </w:tcBorders>
+            <w:vAlign w:val="center"/>
           </w:tcPr>
           <w:p>
             <w:pPr>
-              <w:pStyle w:val="Style15"/>
+              <w:pStyle w:val="user3"/>
               <w:spacing w:lineRule="auto" w:line="240"/>
               <w:ind w:hanging="0" w:left="0"/>
               <w:rPr>
@@ -2649,10 +2820,11 @@
               <w:left w:val="single" w:sz="4" w:space="0" w:color="000000"/>
               <w:bottom w:val="single" w:sz="4" w:space="0" w:color="000000"/>
             </w:tcBorders>
+            <w:vAlign w:val="center"/>
           </w:tcPr>
           <w:p>
             <w:pPr>
-              <w:pStyle w:val="Style15"/>
+              <w:pStyle w:val="user3"/>
               <w:spacing w:lineRule="auto" w:line="240"/>
               <w:ind w:hanging="0" w:left="0"/>
               <w:rPr>
@@ -2673,16 +2845,47 @@
         </w:tc>
         <w:tc>
           <w:tcPr>
-            <w:tcW w:w="4371" w:type="dxa"/>
+            <w:tcW w:w="4120" w:type="dxa"/>
+            <w:tcBorders>
+              <w:left w:val="single" w:sz="4" w:space="0" w:color="000000"/>
+              <w:bottom w:val="single" w:sz="4" w:space="0" w:color="000000"/>
+            </w:tcBorders>
+            <w:vAlign w:val="center"/>
+          </w:tcPr>
+          <w:p>
+            <w:pPr>
+              <w:pStyle w:val="user3"/>
+              <w:spacing w:lineRule="auto" w:line="240"/>
+              <w:ind w:hanging="0" w:left="0"/>
+              <w:rPr>
+                <w:b w:val="false"/>
+                <w:bCs w:val="false"/>
+                <w:lang w:val="uk-UA"/>
+              </w:rPr>
+            </w:pPr>
+            <w:r>
+              <w:rPr>
+                <w:b w:val="false"/>
+                <w:bCs w:val="false"/>
+                <w:lang w:val="uk-UA"/>
+              </w:rPr>
+              <w:t>452</w:t>
+            </w:r>
+          </w:p>
+        </w:tc>
+        <w:tc>
+          <w:tcPr>
+            <w:tcW w:w="2256" w:type="dxa"/>
             <w:tcBorders>
               <w:left w:val="single" w:sz="4" w:space="0" w:color="000000"/>
               <w:bottom w:val="single" w:sz="4" w:space="0" w:color="000000"/>
               <w:right w:val="single" w:sz="4" w:space="0" w:color="000000"/>
             </w:tcBorders>
+            <w:vAlign w:val="center"/>
           </w:tcPr>
           <w:p>
             <w:pPr>
-              <w:pStyle w:val="Style15"/>
+              <w:pStyle w:val="user3"/>
               <w:spacing w:lineRule="auto" w:line="240"/>
               <w:ind w:hanging="0" w:left="0"/>
               <w:rPr>
@@ -2697,7 +2900,7 @@
                 <w:bCs w:val="false"/>
                 <w:lang w:val="uk-UA"/>
               </w:rPr>
-              <w:t>600</w:t>
+              <w:t>75</w:t>
             </w:r>
           </w:p>
         </w:tc>
@@ -2750,7 +2953,19 @@
         <w:rPr>
           <w:lang w:val="uk-UA"/>
         </w:rPr>
-        <w:t>у 3 все одно результат максимальний — 600 правильно визначених екземплярів.</w:t>
+        <w:t xml:space="preserve">у 3 результат </w:t>
+      </w:r>
+      <w:r>
+        <w:rPr>
+          <w:lang w:val="uk-UA"/>
+        </w:rPr>
+        <w:t xml:space="preserve">не змінився </w:t>
+      </w:r>
+      <w:r>
+        <w:rPr>
+          <w:lang w:val="uk-UA"/>
+        </w:rPr>
+        <w:t>— 411 правильно визначених екземплярів.</w:t>
       </w:r>
     </w:p>
     <w:p>
@@ -2785,9 +3000,9 @@
         <w:rPr/>
         <w:drawing>
           <wp:inline distT="0" distB="0" distL="0" distR="0">
-            <wp:extent cx="5238115" cy="3636645"/>
+            <wp:extent cx="6043295" cy="6544310"/>
             <wp:effectExtent l="0" t="0" r="0" b="0"/>
-            <wp:docPr id="9" name="Зображення10"/>
+            <wp:docPr id="9" name="Зображення9"/>
             <wp:cNvGraphicFramePr>
               <a:graphicFrameLocks xmlns:a="http://schemas.openxmlformats.org/drawingml/2006/main" noChangeAspect="1"/>
             </wp:cNvGraphicFramePr>
@@ -2795,13 +3010,14 @@
               <a:graphicData uri="http://schemas.openxmlformats.org/drawingml/2006/picture">
                 <pic:pic xmlns:pic="http://schemas.openxmlformats.org/drawingml/2006/picture">
                   <pic:nvPicPr>
-                    <pic:cNvPr id="9" name="Зображення10"/>
+                    <pic:cNvPr id="9" name="Зображення9"/>
                     <pic:cNvPicPr>
                       <a:picLocks noChangeAspect="1" noChangeArrowheads="1"/>
                     </pic:cNvPicPr>
                   </pic:nvPicPr>
                   <pic:blipFill>
                     <a:blip r:embed="rId10"/>
+                    <a:srcRect l="0" t="0" r="21016" b="21795"/>
                     <a:stretch>
                       <a:fillRect/>
                     </a:stretch>
@@ -2809,7 +3025,7 @@
                   <pic:spPr bwMode="auto">
                     <a:xfrm>
                       <a:off x="0" y="0"/>
-                      <a:ext cx="5238115" cy="3636645"/>
+                      <a:ext cx="6043295" cy="6544310"/>
                     </a:xfrm>
                     <a:prstGeom prst="rect">
                       <a:avLst/>
@@ -2941,9 +3157,9 @@
         <w:rPr/>
         <w:drawing>
           <wp:inline distT="0" distB="0" distL="0" distR="0">
-            <wp:extent cx="6645910" cy="4614545"/>
+            <wp:extent cx="6033770" cy="7976870"/>
             <wp:effectExtent l="0" t="0" r="0" b="0"/>
-            <wp:docPr id="10" name="Зображення11"/>
+            <wp:docPr id="10" name="Зображення10"/>
             <wp:cNvGraphicFramePr>
               <a:graphicFrameLocks xmlns:a="http://schemas.openxmlformats.org/drawingml/2006/main" noChangeAspect="1"/>
             </wp:cNvGraphicFramePr>
@@ -2951,13 +3167,14 @@
               <a:graphicData uri="http://schemas.openxmlformats.org/drawingml/2006/picture">
                 <pic:pic xmlns:pic="http://schemas.openxmlformats.org/drawingml/2006/picture">
                   <pic:nvPicPr>
-                    <pic:cNvPr id="10" name="Зображення11"/>
+                    <pic:cNvPr id="10" name="Зображення10"/>
                     <pic:cNvPicPr>
                       <a:picLocks noChangeAspect="1" noChangeArrowheads="1"/>
                     </pic:cNvPicPr>
                   </pic:nvPicPr>
                   <pic:blipFill>
                     <a:blip r:embed="rId11"/>
+                    <a:srcRect l="0" t="0" r="21016" b="4528"/>
                     <a:stretch>
                       <a:fillRect/>
                     </a:stretch>
@@ -2965,7 +3182,7 @@
                   <pic:spPr bwMode="auto">
                     <a:xfrm>
                       <a:off x="0" y="0"/>
-                      <a:ext cx="6645910" cy="4614545"/>
+                      <a:ext cx="6033770" cy="7976870"/>
                     </a:xfrm>
                     <a:prstGeom prst="rect">
                       <a:avLst/>
@@ -3101,9 +3318,9 @@
         <w:rPr/>
         <w:drawing>
           <wp:inline distT="0" distB="0" distL="0" distR="0">
-            <wp:extent cx="6645910" cy="4614545"/>
+            <wp:extent cx="6029325" cy="7910830"/>
             <wp:effectExtent l="0" t="0" r="0" b="0"/>
-            <wp:docPr id="11" name="Зображення12"/>
+            <wp:docPr id="11" name="Зображення11"/>
             <wp:cNvGraphicFramePr>
               <a:graphicFrameLocks xmlns:a="http://schemas.openxmlformats.org/drawingml/2006/main" noChangeAspect="1"/>
             </wp:cNvGraphicFramePr>
@@ -3111,13 +3328,14 @@
               <a:graphicData uri="http://schemas.openxmlformats.org/drawingml/2006/picture">
                 <pic:pic xmlns:pic="http://schemas.openxmlformats.org/drawingml/2006/picture">
                   <pic:nvPicPr>
-                    <pic:cNvPr id="11" name="Зображення12"/>
+                    <pic:cNvPr id="11" name="Зображення11"/>
                     <pic:cNvPicPr>
                       <a:picLocks noChangeAspect="1" noChangeArrowheads="1"/>
                     </pic:cNvPicPr>
                   </pic:nvPicPr>
                   <pic:blipFill>
                     <a:blip r:embed="rId12"/>
+                    <a:srcRect l="0" t="0" r="21508" b="5828"/>
                     <a:stretch>
                       <a:fillRect/>
                     </a:stretch>
@@ -3125,7 +3343,7 @@
                   <pic:spPr bwMode="auto">
                     <a:xfrm>
                       <a:off x="0" y="0"/>
-                      <a:ext cx="6645910" cy="4614545"/>
+                      <a:ext cx="6029325" cy="7910830"/>
                     </a:xfrm>
                     <a:prstGeom prst="rect">
                       <a:avLst/>
@@ -3261,9 +3479,9 @@
         <w:rPr/>
         <w:drawing>
           <wp:inline distT="0" distB="0" distL="0" distR="0">
-            <wp:extent cx="6645910" cy="4614545"/>
+            <wp:extent cx="6022340" cy="6273165"/>
             <wp:effectExtent l="0" t="0" r="0" b="0"/>
-            <wp:docPr id="12" name="Зображення13"/>
+            <wp:docPr id="12" name="Зображення12"/>
             <wp:cNvGraphicFramePr>
               <a:graphicFrameLocks xmlns:a="http://schemas.openxmlformats.org/drawingml/2006/main" noChangeAspect="1"/>
             </wp:cNvGraphicFramePr>
@@ -3271,13 +3489,14 @@
               <a:graphicData uri="http://schemas.openxmlformats.org/drawingml/2006/picture">
                 <pic:pic xmlns:pic="http://schemas.openxmlformats.org/drawingml/2006/picture">
                   <pic:nvPicPr>
-                    <pic:cNvPr id="12" name="Зображення13"/>
+                    <pic:cNvPr id="12" name="Зображення12"/>
                     <pic:cNvPicPr>
                       <a:picLocks noChangeAspect="1" noChangeArrowheads="1"/>
                     </pic:cNvPicPr>
                   </pic:nvPicPr>
                   <pic:blipFill>
                     <a:blip r:embed="rId13"/>
+                    <a:srcRect l="0" t="0" r="21752" b="25474"/>
                     <a:stretch>
                       <a:fillRect/>
                     </a:stretch>
@@ -3285,7 +3504,7 @@
                   <pic:spPr bwMode="auto">
                     <a:xfrm>
                       <a:off x="0" y="0"/>
-                      <a:ext cx="6645910" cy="4614545"/>
+                      <a:ext cx="6022340" cy="6273165"/>
                     </a:xfrm>
                     <a:prstGeom prst="rect">
                       <a:avLst/>
@@ -3339,73 +3558,7 @@
           <w:smallCaps w:val="false"/>
           <w:spacing w:val="0"/>
         </w:rPr>
-        <w:t xml:space="preserve">4 </w:t>
-      </w:r>
-      <w:r>
-        <w:rPr>
-          <w:b/>
-          <w:bCs/>
-          <w:i w:val="false"/>
-          <w:caps w:val="false"/>
-          <w:smallCaps w:val="false"/>
-          <w:spacing w:val="0"/>
-        </w:rPr>
-        <w:t>П</w:t>
-      </w:r>
-      <w:r>
-        <w:rPr>
-          <w:b/>
-          <w:bCs/>
-          <w:i w:val="false"/>
-          <w:caps w:val="false"/>
-          <w:smallCaps w:val="false"/>
-          <w:spacing w:val="0"/>
-        </w:rPr>
-        <w:t xml:space="preserve">орівняти отримані моделі </w:t>
-      </w:r>
-      <w:r>
-        <w:rPr>
-          <w:b/>
-          <w:bCs/>
-          <w:i w:val="false"/>
-          <w:caps w:val="false"/>
-          <w:smallCaps w:val="false"/>
-          <w:spacing w:val="0"/>
-        </w:rPr>
-        <w:t xml:space="preserve">через </w:t>
-      </w:r>
-      <w:r>
-        <w:rPr>
-          <w:b/>
-          <w:bCs/>
-          <w:i w:val="false"/>
-          <w:caps w:val="false"/>
-          <w:smallCaps w:val="false"/>
-          <w:spacing w:val="0"/>
-        </w:rPr>
-        <w:t>модул</w:t>
-      </w:r>
-      <w:r>
-        <w:rPr>
-          <w:b/>
-          <w:bCs/>
-          <w:i w:val="false"/>
-          <w:caps w:val="false"/>
-          <w:smallCaps w:val="false"/>
-          <w:spacing w:val="0"/>
-        </w:rPr>
-        <w:t>ь</w:t>
-      </w:r>
-      <w:r>
-        <w:rPr>
-          <w:b/>
-          <w:bCs/>
-          <w:i w:val="false"/>
-          <w:caps w:val="false"/>
-          <w:smallCaps w:val="false"/>
-          <w:spacing w:val="0"/>
-        </w:rPr>
-        <w:t xml:space="preserve"> Experimenter</w:t>
+        <w:t>4 Порівняти отримані моделі через модуль Experimenter</w:t>
       </w:r>
     </w:p>
     <w:p>
@@ -3638,6 +3791,28 @@
       <w:r>
         <w:rPr/>
         <w:t>Благодаттю Господа Ісуса Христа було зроблено роботу.</w:t>
+      </w:r>
+    </w:p>
+    <w:p>
+      <w:pPr>
+        <w:pStyle w:val="p11"/>
+        <w:rPr/>
+      </w:pPr>
+      <w:r>
+        <w:rPr/>
+        <w:t xml:space="preserve">Метод </w:t>
+      </w:r>
+      <w:r>
+        <w:rPr>
+          <w:lang w:val="en-US"/>
+        </w:rPr>
+        <w:t xml:space="preserve">J48 </w:t>
+      </w:r>
+      <w:r>
+        <w:rPr>
+          <w:lang w:val="uk-UA"/>
+        </w:rPr>
+        <w:t>випереджає всіх інших.</w:t>
       </w:r>
     </w:p>
     <w:p>
@@ -5112,13 +5287,13 @@
       <w:lang w:val="en-US" w:eastAsia="uk-UA"/>
     </w:rPr>
   </w:style>
-  <w:style w:type="character" w:styleId="Style12">
-    <w:name w:val="Символ нумерації"/>
+  <w:style w:type="character" w:styleId="user">
+    <w:name w:val="Символ нумерації (user)"/>
     <w:qFormat/>
     <w:rPr/>
   </w:style>
-  <w:style w:type="character" w:styleId="user">
-    <w:name w:val="Маркери (user)"/>
+  <w:style w:type="character" w:styleId="Style12">
+    <w:name w:val="Маркери"/>
     <w:qFormat/>
     <w:rPr>
       <w:rFonts w:ascii="OpenSymbol" w:hAnsi="OpenSymbol" w:eastAsia="OpenSymbol" w:cs="OpenSymbol"/>
@@ -5134,7 +5309,7 @@
       <w:spacing w:before="240" w:after="120"/>
     </w:pPr>
     <w:rPr>
-      <w:rFonts w:ascii="Liberation Sans" w:hAnsi="Liberation Sans" w:eastAsia="Microsoft YaHei" w:cs="Lucida Sans"/>
+      <w:rFonts w:ascii="Liberation Sans" w:hAnsi="Liberation Sans" w:eastAsia="Microsoft YaHei" w:cs="Arial Unicode MS"/>
       <w:sz w:val="28"/>
       <w:szCs w:val="28"/>
     </w:rPr>
@@ -5179,7 +5354,7 @@
       <w:suppressLineNumbers/>
     </w:pPr>
     <w:rPr>
-      <w:rFonts w:cs="Lucida Sans"/>
+      <w:rFonts w:cs="Arial Unicode MS"/>
     </w:rPr>
   </w:style>
   <w:style w:type="paragraph" w:styleId="user1">
@@ -5192,7 +5367,7 @@
       <w:spacing w:before="240" w:after="120"/>
     </w:pPr>
     <w:rPr>
-      <w:rFonts w:ascii="Liberation Sans" w:hAnsi="Liberation Sans" w:eastAsia="Microsoft YaHei" w:cs="Arial Unicode MS"/>
+      <w:rFonts w:ascii="Liberation Sans" w:hAnsi="Liberation Sans" w:eastAsia="Microsoft YaHei" w:cs="Lucida Sans"/>
       <w:sz w:val="28"/>
       <w:szCs w:val="28"/>
     </w:rPr>
@@ -5205,12 +5380,12 @@
       <w:suppressLineNumbers/>
     </w:pPr>
     <w:rPr>
-      <w:rFonts w:cs="Arial Unicode MS"/>
+      <w:rFonts w:cs="Lucida Sans"/>
     </w:rPr>
   </w:style>
   <w:style w:type="paragraph" w:styleId="IndexHeading">
     <w:name w:val="index heading"/>
-    <w:basedOn w:val="user1"/>
+    <w:basedOn w:val="Style13"/>
     <w:pPr/>
     <w:rPr/>
   </w:style>
@@ -5399,7 +5574,7 @@
     <w:rsid w:val="00485ae4"/>
     <w:pPr>
       <w:tabs>
-        <w:tab w:val="clear" w:pos="851"/>
+        <w:tab w:val="clear" w:pos="643"/>
         <w:tab w:val="left" w:pos="916" w:leader="none"/>
         <w:tab w:val="left" w:pos="1832" w:leader="none"/>
         <w:tab w:val="left" w:pos="2748" w:leader="none"/>
@@ -5516,8 +5691,8 @@
     </w:pPr>
     <w:rPr/>
   </w:style>
-  <w:style w:type="paragraph" w:styleId="Style15">
-    <w:name w:val="Вміст таблиці"/>
+  <w:style w:type="paragraph" w:styleId="user3">
+    <w:name w:val="Вміст таблиці (user)"/>
     <w:basedOn w:val="Normal"/>
     <w:qFormat/>
     <w:pPr>
@@ -5526,9 +5701,9 @@
     </w:pPr>
     <w:rPr/>
   </w:style>
-  <w:style w:type="paragraph" w:styleId="Style16">
-    <w:name w:val="Заголовок таблиці"/>
-    <w:basedOn w:val="Style15"/>
+  <w:style w:type="paragraph" w:styleId="user4">
+    <w:name w:val="Заголовок таблиці (user)"/>
+    <w:basedOn w:val="user3"/>
     <w:qFormat/>
     <w:pPr>
       <w:suppressLineNumbers/>
@@ -5539,8 +5714,8 @@
       <w:bCs/>
     </w:rPr>
   </w:style>
-  <w:style w:type="numbering" w:styleId="user3" w:default="1">
-    <w:name w:val="Без маркерів (user)"/>
+  <w:style w:type="numbering" w:styleId="Style15" w:default="1">
+    <w:name w:val="Без маркерів"/>
     <w:uiPriority w:val="99"/>
     <w:semiHidden/>
     <w:unhideWhenUsed/>

</xml_diff>